<commit_message>
docs: finalize Section 10 with verified YouTrack deadlines
</commit_message>
<xml_diff>
--- a/docs/10-project-management-risks.docx
+++ b/docs/10-project-management-risks.docx
@@ -6,29 +6,45 @@
       <w:pPr>
         <w:pStyle w:val="1"/>
         <w:pageBreakBefore/>
-        <w:rPr>
-          <w:rFonts w:ascii="Times New Roman" w:hAnsi="Times New Roman" w:cs="Times New Roman"/>
-        </w:rPr>
       </w:pPr>
       <w:r>
-        <w:rPr>
-          <w:rFonts w:ascii="Times New Roman" w:hAnsi="Times New Roman" w:cs="Times New Roman"/>
-        </w:rPr>
         <w:t>10. Project Management and Risks</w:t>
       </w:r>
     </w:p>
     <w:p>
       <w:pPr>
         <w:pStyle w:val="2"/>
-        <w:rPr>
-          <w:rFonts w:ascii="Times New Roman" w:hAnsi="Times New Roman" w:cs="Times New Roman"/>
-        </w:rPr>
       </w:pPr>
       <w:r>
-        <w:rPr>
-          <w:rFonts w:ascii="Times New Roman" w:hAnsi="Times New Roman" w:cs="Times New Roman"/>
-        </w:rPr>
         <w:t>10.1 Repository and tools</w:t>
+      </w:r>
+    </w:p>
+    <w:p>
+      <w:pPr>
+        <w:pStyle w:val="a7"/>
+        <w:numPr>
+          <w:ilvl w:val="0"/>
+          <w:numId w:val="1"/>
+        </w:numPr>
+        <w:spacing w:after="60" w:line="276" w:lineRule="auto"/>
+        <w:contextualSpacing w:val="0"/>
+      </w:pPr>
+      <w:r>
+        <w:t>Git repository: https://github.com/aknur111/MedGuardAI (public). Work is organized through feature branches and pull requests; mandatory peer review and main-branch protection were not enabled at the time of the documented review. The intended submission tag is pre-defense-1; YouTrack MED-14 still mentions the older prob-period-1 tag and should be updated after team confirmation.</w:t>
+      </w:r>
+    </w:p>
+    <w:p>
+      <w:pPr>
+        <w:pStyle w:val="a7"/>
+        <w:numPr>
+          <w:ilvl w:val="0"/>
+          <w:numId w:val="1"/>
+        </w:numPr>
+        <w:spacing w:after="60" w:line="276" w:lineRule="auto"/>
+        <w:contextualSpacing w:val="0"/>
+      </w:pPr>
+      <w:r>
+        <w:t>YouTrack project: MED (https://medguard.youtrack.cloud/issues). Current tasks use MED identifiers; the initial MSA labels are historical planning identifiers and should not be used as YouTrack issue links.</w:t>
       </w:r>
     </w:p>
     <w:p>
@@ -46,67 +62,23 @@
           <w:b/>
           <w:bCs/>
         </w:rPr>
-        <w:t>Git repository:</w:t>
       </w:r>
-      <w:r>
-        <w:t xml:space="preserve"> GitHub, private, access for supervisor and committee; branch protection on main; changes via pull requests reviewed by another team member; each submission tagged as required by the department (first submission: prob-period-1); tags are never moved.</w:t>
-      </w:r>
-    </w:p>
-    <w:p>
-      <w:pPr>
-        <w:pStyle w:val="a7"/>
-        <w:numPr>
-          <w:ilvl w:val="0"/>
-          <w:numId w:val="1"/>
-        </w:numPr>
-        <w:spacing w:after="60" w:line="276" w:lineRule="auto"/>
-        <w:contextualSpacing w:val="0"/>
-      </w:pPr>
-      <w:r>
-        <w:t>YouTrack project: key MED; tasks have an owner, acceptance criteria, deadline and priority. Task identifiers appear in branch/commit names (e.g. MED-13-context-diagram); historical MSA task IDs in the initial plan remain for traceability.</w:t>
-      </w:r>
-    </w:p>
-    <w:p>
-      <w:pPr>
-        <w:pStyle w:val="a7"/>
-        <w:numPr>
-          <w:ilvl w:val="0"/>
-          <w:numId w:val="1"/>
-        </w:numPr>
-        <w:spacing w:after="60" w:line="276" w:lineRule="auto"/>
-        <w:contextualSpacing w:val="0"/>
-      </w:pPr>
-      <w:r>
-        <w:rPr>
-          <w:b/>
-          <w:bCs/>
-        </w:rPr>
-        <w:t>CI:</w:t>
-      </w:r>
-      <w:r>
-        <w:t xml:space="preserve"> GitHub Actions </w:t>
-      </w:r>
+      <w:r/>
       <w:r>
         <w:rPr>
           <w:lang w:val="en-US"/>
         </w:rPr>
-        <w:t>-</w:t>
       </w:r>
+      <w:r/>
       <w:r>
-        <w:t xml:space="preserve"> lint, tests, diagram rendering check.</w:t>
+        <w:t>Planned CI: GitHub Actions for linting, tests and diagram rendering (enable and verify workflows when implementation is ready).</w:t>
       </w:r>
     </w:p>
     <w:p>
       <w:pPr>
         <w:pStyle w:val="3"/>
-        <w:rPr>
-          <w:rFonts w:cs="Times New Roman"/>
-        </w:rPr>
       </w:pPr>
       <w:r>
-        <w:rPr>
-          <w:rFonts w:cs="Times New Roman"/>
-        </w:rPr>
         <w:t>Repository structure</w:t>
       </w:r>
     </w:p>
@@ -124,7 +96,7 @@
       </w:pPr>
       <w:r>
         <w:rPr>
-          <w:rFonts w:eastAsia="Consolas"/>
+          <w:rFonts w:ascii="Consolas" w:eastAsia="Consolas" w:hAnsi="Consolas" w:cs="Consolas"/>
           <w:sz w:val="17"/>
           <w:szCs w:val="17"/>
         </w:rPr>
@@ -137,7 +109,7 @@
       </w:pPr>
       <w:r>
         <w:rPr>
-          <w:rFonts w:eastAsia="Consolas"/>
+          <w:rFonts w:ascii="Consolas" w:eastAsia="Consolas" w:hAnsi="Consolas" w:cs="Consolas"/>
           <w:sz w:val="17"/>
           <w:szCs w:val="17"/>
         </w:rPr>
@@ -150,7 +122,7 @@
       </w:pPr>
       <w:r>
         <w:rPr>
-          <w:rFonts w:eastAsia="Consolas"/>
+          <w:rFonts w:ascii="Consolas" w:eastAsia="Consolas" w:hAnsi="Consolas" w:cs="Consolas"/>
           <w:sz w:val="17"/>
           <w:szCs w:val="17"/>
         </w:rPr>
@@ -179,7 +151,7 @@
       </w:pPr>
       <w:r>
         <w:rPr>
-          <w:rFonts w:eastAsia="Consolas"/>
+          <w:rFonts w:ascii="Consolas" w:eastAsia="Consolas" w:hAnsi="Consolas" w:cs="Consolas"/>
           <w:sz w:val="17"/>
           <w:szCs w:val="17"/>
         </w:rPr>
@@ -192,7 +164,7 @@
       </w:pPr>
       <w:r>
         <w:rPr>
-          <w:rFonts w:eastAsia="Consolas"/>
+          <w:rFonts w:ascii="Consolas" w:eastAsia="Consolas" w:hAnsi="Consolas" w:cs="Consolas"/>
           <w:sz w:val="17"/>
           <w:szCs w:val="17"/>
         </w:rPr>
@@ -205,7 +177,7 @@
       </w:pPr>
       <w:r>
         <w:rPr>
-          <w:rFonts w:eastAsia="Consolas"/>
+          <w:rFonts w:ascii="Consolas" w:eastAsia="Consolas" w:hAnsi="Consolas" w:cs="Consolas"/>
           <w:sz w:val="17"/>
           <w:szCs w:val="17"/>
         </w:rPr>
@@ -226,7 +198,7 @@
       </w:pPr>
       <w:r>
         <w:rPr>
-          <w:rFonts w:eastAsia="Consolas"/>
+          <w:rFonts w:ascii="Consolas" w:eastAsia="Consolas" w:hAnsi="Consolas" w:cs="Consolas"/>
           <w:sz w:val="17"/>
           <w:szCs w:val="17"/>
         </w:rPr>
@@ -239,7 +211,7 @@
       </w:pPr>
       <w:r>
         <w:rPr>
-          <w:rFonts w:eastAsia="Consolas"/>
+          <w:rFonts w:ascii="Consolas" w:eastAsia="Consolas" w:hAnsi="Consolas" w:cs="Consolas"/>
           <w:sz w:val="17"/>
           <w:szCs w:val="17"/>
         </w:rPr>
@@ -252,7 +224,7 @@
       </w:pPr>
       <w:r>
         <w:rPr>
-          <w:rFonts w:eastAsia="Consolas"/>
+          <w:rFonts w:ascii="Consolas" w:eastAsia="Consolas" w:hAnsi="Consolas" w:cs="Consolas"/>
           <w:sz w:val="17"/>
           <w:szCs w:val="17"/>
         </w:rPr>
@@ -265,7 +237,7 @@
       </w:pPr>
       <w:r>
         <w:rPr>
-          <w:rFonts w:eastAsia="Consolas"/>
+          <w:rFonts w:ascii="Consolas" w:eastAsia="Consolas" w:hAnsi="Consolas" w:cs="Consolas"/>
           <w:sz w:val="17"/>
           <w:szCs w:val="17"/>
         </w:rPr>
@@ -281,14 +253,8 @@
     <w:p>
       <w:pPr>
         <w:pStyle w:val="2"/>
-        <w:rPr>
-          <w:rFonts w:ascii="Times New Roman" w:hAnsi="Times New Roman" w:cs="Times New Roman"/>
-        </w:rPr>
       </w:pPr>
       <w:r>
-        <w:rPr>
-          <w:rFonts w:ascii="Times New Roman" w:hAnsi="Times New Roman" w:cs="Times New Roman"/>
-        </w:rPr>
         <w:t>10.2 Roles and responsibilities</w:t>
       </w:r>
     </w:p>
@@ -298,7 +264,7 @@
         <w:jc w:val="both"/>
       </w:pPr>
       <w:r>
-        <w:t>Each member leads assigned workstreams and supports others. Changes are submitted through pull requests and reviewed by another team member before merging. The responsibilities below describe the agreed project plan, not a claim that every feature has already been implemented.</w:t>
+        <w:t>Each member leads assigned workstreams and supports others. Changes are submitted through pull requests; peer review is encouraged but is not currently enforced by repository settings. The responsibilities below describe the agreed project plan, not a claim that every feature has already been implemented.</w:t>
       </w:r>
     </w:p>
     <w:tbl>
@@ -327,6 +293,8 @@
       <w:tr>
         <w:trPr>
           <w:tblHeader/>
+          <w:tblHeader w:val="true"/>
+          <w:cantSplit/>
         </w:trPr>
         <w:tc>
           <w:tcPr>
@@ -460,6 +428,7 @@
       <w:tr>
         <w:trPr>
           <w:cantSplit/>
+          <w:cantSplit/>
         </w:trPr>
         <w:tc>
           <w:tcPr>
@@ -574,6 +543,7 @@
       <w:tr>
         <w:trPr>
           <w:cantSplit/>
+          <w:cantSplit/>
         </w:trPr>
         <w:tc>
           <w:tcPr>
@@ -600,7 +570,6 @@
                 <w:sz w:val="18"/>
                 <w:szCs w:val="18"/>
               </w:rPr>
-              <w:lastRenderedPageBreak/>
               <w:t>Salemkan Aknur</w:t>
             </w:r>
           </w:p>
@@ -703,6 +672,7 @@
       </w:tr>
       <w:tr>
         <w:trPr>
+          <w:cantSplit/>
           <w:cantSplit/>
         </w:trPr>
         <w:tc>
@@ -829,28 +799,15 @@
     <w:p>
       <w:pPr>
         <w:pStyle w:val="2"/>
-        <w:rPr>
-          <w:rFonts w:ascii="Times New Roman" w:hAnsi="Times New Roman" w:cs="Times New Roman"/>
-        </w:rPr>
       </w:pPr>
       <w:r>
-        <w:rPr>
-          <w:rFonts w:ascii="Times New Roman" w:hAnsi="Times New Roman" w:cs="Times New Roman"/>
-        </w:rPr>
-        <w:t>10.</w:t>
+        <w:t>10.3 Task plan and tracked deliverables (October 2026)</w:t>
       </w:r>
+    </w:p>
+    <w:p>
+      <w:pPr/>
       <w:r>
-        <w:rPr>
-          <w:rFonts w:ascii="Times New Roman" w:hAnsi="Times New Roman" w:cs="Times New Roman"/>
-          <w:lang w:val="ru-RU"/>
-        </w:rPr>
-        <w:t>3</w:t>
-      </w:r>
-      <w:r>
-        <w:rPr>
-          <w:rFonts w:ascii="Times New Roman" w:hAnsi="Times New Roman" w:cs="Times New Roman"/>
-        </w:rPr>
-        <w:t xml:space="preserve"> Task plan until 24 October 2026</w:t>
+        <w:t>Deadline source (24 October 2026): Dates in Table 10.2 were transcribed from screenshots of the Due field in individual MedGuard YouTrack issues MED-1–MED-14 and MED-16–MED-18. MED-15 was not shown and is not included. The time 18:00 for MED-14 comes from its acceptance criteria; YouTrack displays the due date as 24 October 2026.</w:t>
       </w:r>
     </w:p>
     <w:tbl>
@@ -879,6 +836,8 @@
       <w:tr>
         <w:trPr>
           <w:tblHeader/>
+          <w:tblHeader w:val="true"/>
+          <w:cantSplit/>
         </w:trPr>
         <w:tc>
           <w:tcPr>
@@ -962,17 +921,8 @@
             </w:tcMar>
           </w:tcPr>
           <w:p>
-            <w:pPr>
-              <w:spacing w:after="20" w:line="252" w:lineRule="auto"/>
-            </w:pPr>
-            <w:r>
-              <w:rPr>
-                <w:b/>
-                <w:bCs/>
-                <w:sz w:val="17"/>
-                <w:szCs w:val="17"/>
-              </w:rPr>
-              <w:t>Due</w:t>
+            <w:r>
+              <w:t>Due (YouTrack)</w:t>
             </w:r>
           </w:p>
         </w:tc>
@@ -1015,132 +965,41 @@
         </w:trPr>
         <w:tc>
           <w:tcPr>
-            <w:tcW w:w="4307" w:type="dxa"/>
-            <w:tcBorders>
-              <w:top w:val="single" w:sz="4" w:space="0" w:color="A6B4C4"/>
-              <w:left w:val="single" w:sz="4" w:space="0" w:color="A6B4C4"/>
-              <w:bottom w:val="single" w:sz="4" w:space="0" w:color="A6B4C4"/>
-              <w:right w:val="single" w:sz="4" w:space="0" w:color="A6B4C4"/>
-            </w:tcBorders>
-            <w:tcMar>
-              <w:top w:w="50" w:type="dxa"/>
-              <w:left w:w="90" w:type="dxa"/>
-              <w:bottom w:w="50" w:type="dxa"/>
-              <w:right w:w="90" w:type="dxa"/>
-            </w:tcMar>
-          </w:tcPr>
-          <w:p>
-            <w:pPr>
-              <w:spacing w:after="20" w:line="252" w:lineRule="auto"/>
-            </w:pPr>
-            <w:r>
-              <w:rPr>
-                <w:sz w:val="17"/>
-                <w:szCs w:val="17"/>
-              </w:rPr>
-              <w:t>MSA-1 Create GitHub repo, structure, .gitignore, README; invite team and supervisor</w:t>
-            </w:r>
-          </w:p>
-        </w:tc>
-        <w:tc>
-          <w:tcPr>
-            <w:tcW w:w="1435" w:type="dxa"/>
-            <w:tcBorders>
-              <w:top w:val="single" w:sz="4" w:space="0" w:color="A6B4C4"/>
-              <w:left w:val="single" w:sz="4" w:space="0" w:color="A6B4C4"/>
-              <w:bottom w:val="single" w:sz="4" w:space="0" w:color="A6B4C4"/>
-              <w:right w:val="single" w:sz="4" w:space="0" w:color="A6B4C4"/>
-            </w:tcBorders>
-            <w:tcMar>
-              <w:top w:w="50" w:type="dxa"/>
-              <w:left w:w="90" w:type="dxa"/>
-              <w:bottom w:w="50" w:type="dxa"/>
-              <w:right w:w="90" w:type="dxa"/>
-            </w:tcMar>
-          </w:tcPr>
-          <w:p>
-            <w:pPr>
-              <w:spacing w:after="20" w:line="252" w:lineRule="auto"/>
-            </w:pPr>
-            <w:r>
-              <w:rPr>
-                <w:sz w:val="17"/>
-                <w:szCs w:val="17"/>
-              </w:rPr>
-              <w:t xml:space="preserve">Aknur </w:t>
-            </w:r>
-            <w:r>
-              <w:rPr>
-                <w:sz w:val="17"/>
-                <w:szCs w:val="17"/>
-                <w:lang w:val="en-US"/>
-              </w:rPr>
-              <w:t xml:space="preserve">and </w:t>
-            </w:r>
-            <w:r>
-              <w:rPr>
-                <w:sz w:val="17"/>
-                <w:szCs w:val="17"/>
-              </w:rPr>
-              <w:t>Nuray</w:t>
-            </w:r>
-          </w:p>
-        </w:tc>
-        <w:tc>
-          <w:tcPr>
-            <w:tcW w:w="923" w:type="dxa"/>
-            <w:tcBorders>
-              <w:top w:val="single" w:sz="4" w:space="0" w:color="A6B4C4"/>
-              <w:left w:val="single" w:sz="4" w:space="0" w:color="A6B4C4"/>
-              <w:bottom w:val="single" w:sz="4" w:space="0" w:color="A6B4C4"/>
-              <w:right w:val="single" w:sz="4" w:space="0" w:color="A6B4C4"/>
-            </w:tcBorders>
-            <w:tcMar>
-              <w:top w:w="50" w:type="dxa"/>
-              <w:left w:w="90" w:type="dxa"/>
-              <w:bottom w:w="50" w:type="dxa"/>
-              <w:right w:w="90" w:type="dxa"/>
-            </w:tcMar>
-          </w:tcPr>
-          <w:p>
-            <w:pPr>
-              <w:spacing w:after="20" w:line="252" w:lineRule="auto"/>
-            </w:pPr>
-            <w:r>
-              <w:rPr>
-                <w:sz w:val="17"/>
-                <w:szCs w:val="17"/>
-              </w:rPr>
-              <w:t>22 Oct</w:t>
-            </w:r>
-          </w:p>
-        </w:tc>
-        <w:tc>
-          <w:tcPr>
-            <w:tcW w:w="2361" w:type="dxa"/>
-            <w:tcBorders>
-              <w:top w:val="single" w:sz="4" w:space="0" w:color="A6B4C4"/>
-              <w:left w:val="single" w:sz="4" w:space="0" w:color="A6B4C4"/>
-              <w:bottom w:val="single" w:sz="4" w:space="0" w:color="A6B4C4"/>
-              <w:right w:val="single" w:sz="4" w:space="0" w:color="A6B4C4"/>
-            </w:tcBorders>
-            <w:tcMar>
-              <w:top w:w="50" w:type="dxa"/>
-              <w:left w:w="90" w:type="dxa"/>
-              <w:bottom w:w="50" w:type="dxa"/>
-              <w:right w:w="90" w:type="dxa"/>
-            </w:tcMar>
-          </w:tcPr>
-          <w:p>
-            <w:pPr>
-              <w:spacing w:after="20" w:line="252" w:lineRule="auto"/>
-            </w:pPr>
-            <w:r>
-              <w:rPr>
-                <w:sz w:val="17"/>
-                <w:szCs w:val="17"/>
-              </w:rPr>
-              <w:t>Supervisor has access; README has all required sections</w:t>
+            <w:tcW w:type="dxa" w:w="4307"/>
+          </w:tcPr>
+          <w:p>
+            <w:r>
+              <w:t>MED-1 Create GitHub repository and initial structure</w:t>
+            </w:r>
+          </w:p>
+        </w:tc>
+        <w:tc>
+          <w:tcPr>
+            <w:tcW w:type="dxa" w:w="1435"/>
+          </w:tcPr>
+          <w:p>
+            <w:r>
+              <w:t>Aknur</w:t>
+            </w:r>
+          </w:p>
+        </w:tc>
+        <w:tc>
+          <w:tcPr>
+            <w:tcW w:type="dxa" w:w="923"/>
+          </w:tcPr>
+          <w:p>
+            <w:r>
+              <w:t>17 Oct 2026</w:t>
+            </w:r>
+          </w:p>
+        </w:tc>
+        <w:tc>
+          <w:tcPr>
+            <w:tcW w:type="dxa" w:w="2361"/>
+          </w:tcPr>
+          <w:p>
+            <w:r>
+              <w:t>Repository and README created; supervisor access to be verified</w:t>
             </w:r>
           </w:p>
         </w:tc>
@@ -1151,138 +1010,41 @@
         </w:trPr>
         <w:tc>
           <w:tcPr>
-            <w:tcW w:w="4307" w:type="dxa"/>
-            <w:tcBorders>
-              <w:top w:val="single" w:sz="4" w:space="0" w:color="A6B4C4"/>
-              <w:left w:val="single" w:sz="4" w:space="0" w:color="A6B4C4"/>
-              <w:bottom w:val="single" w:sz="4" w:space="0" w:color="A6B4C4"/>
-              <w:right w:val="single" w:sz="4" w:space="0" w:color="A6B4C4"/>
-            </w:tcBorders>
-            <w:tcMar>
-              <w:top w:w="50" w:type="dxa"/>
-              <w:left w:w="90" w:type="dxa"/>
-              <w:bottom w:w="50" w:type="dxa"/>
-              <w:right w:w="90" w:type="dxa"/>
-            </w:tcMar>
-          </w:tcPr>
-          <w:p>
-            <w:pPr>
-              <w:spacing w:after="20" w:line="252" w:lineRule="auto"/>
-            </w:pPr>
-            <w:r>
-              <w:rPr>
-                <w:sz w:val="17"/>
-                <w:szCs w:val="17"/>
-              </w:rPr>
-              <w:t>MSA-2 Set up YouTrack project and board; create tasks with owners, priorities, deadlines</w:t>
-            </w:r>
-          </w:p>
-        </w:tc>
-        <w:tc>
-          <w:tcPr>
-            <w:tcW w:w="1435" w:type="dxa"/>
-            <w:tcBorders>
-              <w:top w:val="single" w:sz="4" w:space="0" w:color="A6B4C4"/>
-              <w:left w:val="single" w:sz="4" w:space="0" w:color="A6B4C4"/>
-              <w:bottom w:val="single" w:sz="4" w:space="0" w:color="A6B4C4"/>
-              <w:right w:val="single" w:sz="4" w:space="0" w:color="A6B4C4"/>
-            </w:tcBorders>
-            <w:tcMar>
-              <w:top w:w="50" w:type="dxa"/>
-              <w:left w:w="90" w:type="dxa"/>
-              <w:bottom w:w="50" w:type="dxa"/>
-              <w:right w:w="90" w:type="dxa"/>
-            </w:tcMar>
-          </w:tcPr>
-          <w:p>
-            <w:pPr>
-              <w:spacing w:after="20" w:line="252" w:lineRule="auto"/>
-              <w:rPr>
-                <w:lang w:val="en-US"/>
-              </w:rPr>
-            </w:pPr>
-            <w:r>
-              <w:rPr>
-                <w:sz w:val="17"/>
-                <w:szCs w:val="17"/>
-              </w:rPr>
-              <w:t>A</w:t>
-            </w:r>
-            <w:r>
-              <w:rPr>
-                <w:sz w:val="17"/>
-                <w:szCs w:val="17"/>
-                <w:lang w:val="en-US"/>
-              </w:rPr>
-              <w:t xml:space="preserve">knur and </w:t>
-            </w:r>
-            <w:proofErr w:type="spellStart"/>
-            <w:r>
-              <w:rPr>
-                <w:sz w:val="17"/>
-                <w:szCs w:val="17"/>
-                <w:lang w:val="en-US"/>
-              </w:rPr>
-              <w:t>Altynay</w:t>
-            </w:r>
-            <w:proofErr w:type="spellEnd"/>
-          </w:p>
-        </w:tc>
-        <w:tc>
-          <w:tcPr>
-            <w:tcW w:w="923" w:type="dxa"/>
-            <w:tcBorders>
-              <w:top w:val="single" w:sz="4" w:space="0" w:color="A6B4C4"/>
-              <w:left w:val="single" w:sz="4" w:space="0" w:color="A6B4C4"/>
-              <w:bottom w:val="single" w:sz="4" w:space="0" w:color="A6B4C4"/>
-              <w:right w:val="single" w:sz="4" w:space="0" w:color="A6B4C4"/>
-            </w:tcBorders>
-            <w:tcMar>
-              <w:top w:w="50" w:type="dxa"/>
-              <w:left w:w="90" w:type="dxa"/>
-              <w:bottom w:w="50" w:type="dxa"/>
-              <w:right w:w="90" w:type="dxa"/>
-            </w:tcMar>
-          </w:tcPr>
-          <w:p>
-            <w:pPr>
-              <w:spacing w:after="20" w:line="252" w:lineRule="auto"/>
-            </w:pPr>
-            <w:r>
-              <w:rPr>
-                <w:sz w:val="17"/>
-                <w:szCs w:val="17"/>
-              </w:rPr>
-              <w:t>19 Oct</w:t>
-            </w:r>
-          </w:p>
-        </w:tc>
-        <w:tc>
-          <w:tcPr>
-            <w:tcW w:w="2361" w:type="dxa"/>
-            <w:tcBorders>
-              <w:top w:val="single" w:sz="4" w:space="0" w:color="A6B4C4"/>
-              <w:left w:val="single" w:sz="4" w:space="0" w:color="A6B4C4"/>
-              <w:bottom w:val="single" w:sz="4" w:space="0" w:color="A6B4C4"/>
-              <w:right w:val="single" w:sz="4" w:space="0" w:color="A6B4C4"/>
-            </w:tcBorders>
-            <w:tcMar>
-              <w:top w:w="50" w:type="dxa"/>
-              <w:left w:w="90" w:type="dxa"/>
-              <w:bottom w:w="50" w:type="dxa"/>
-              <w:right w:w="90" w:type="dxa"/>
-            </w:tcMar>
-          </w:tcPr>
-          <w:p>
-            <w:pPr>
-              <w:spacing w:after="20" w:line="252" w:lineRule="auto"/>
-            </w:pPr>
-            <w:r>
-              <w:rPr>
-                <w:sz w:val="17"/>
-                <w:szCs w:val="17"/>
-              </w:rPr>
-              <w:t>Link in README; all tasks assigned</w:t>
+            <w:tcW w:type="dxa" w:w="4307"/>
+          </w:tcPr>
+          <w:p>
+            <w:r>
+              <w:t>MED-2 Set up YouTrack project and task board</w:t>
+            </w:r>
+          </w:p>
+        </w:tc>
+        <w:tc>
+          <w:tcPr>
+            <w:tcW w:type="dxa" w:w="1435"/>
+          </w:tcPr>
+          <w:p>
+            <w:r>
+              <w:t>Aknur</w:t>
+            </w:r>
+          </w:p>
+        </w:tc>
+        <w:tc>
+          <w:tcPr>
+            <w:tcW w:type="dxa" w:w="923"/>
+          </w:tcPr>
+          <w:p>
+            <w:r>
+              <w:t>17 Oct 2026</w:t>
+            </w:r>
+          </w:p>
+        </w:tc>
+        <w:tc>
+          <w:tcPr>
+            <w:tcW w:type="dxa" w:w="2361"/>
+          </w:tcPr>
+          <w:p>
+            <w:r>
+              <w:t>Project board and task ownership documented</w:t>
             </w:r>
           </w:p>
         </w:tc>
@@ -1293,110 +1055,41 @@
         </w:trPr>
         <w:tc>
           <w:tcPr>
-            <w:tcW w:w="4307" w:type="dxa"/>
-            <w:tcBorders>
-              <w:top w:val="single" w:sz="4" w:space="0" w:color="A6B4C4"/>
-              <w:left w:val="single" w:sz="4" w:space="0" w:color="A6B4C4"/>
-              <w:bottom w:val="single" w:sz="4" w:space="0" w:color="A6B4C4"/>
-              <w:right w:val="single" w:sz="4" w:space="0" w:color="A6B4C4"/>
-            </w:tcBorders>
-            <w:tcMar>
-              <w:top w:w="50" w:type="dxa"/>
-              <w:left w:w="90" w:type="dxa"/>
-              <w:bottom w:w="50" w:type="dxa"/>
-              <w:right w:w="90" w:type="dxa"/>
-            </w:tcMar>
-          </w:tcPr>
-          <w:p>
-            <w:r>
-              <w:t>MSA-3 Project proposal and scope (Section 1), updated to MedGuard requirements</w:t>
-            </w:r>
-          </w:p>
-        </w:tc>
-        <w:tc>
-          <w:tcPr>
-            <w:tcW w:w="1435" w:type="dxa"/>
-            <w:tcBorders>
-              <w:top w:val="single" w:sz="4" w:space="0" w:color="A6B4C4"/>
-              <w:left w:val="single" w:sz="4" w:space="0" w:color="A6B4C4"/>
-              <w:bottom w:val="single" w:sz="4" w:space="0" w:color="A6B4C4"/>
-              <w:right w:val="single" w:sz="4" w:space="0" w:color="A6B4C4"/>
-            </w:tcBorders>
-            <w:tcMar>
-              <w:top w:w="50" w:type="dxa"/>
-              <w:left w:w="90" w:type="dxa"/>
-              <w:bottom w:w="50" w:type="dxa"/>
-              <w:right w:w="90" w:type="dxa"/>
-            </w:tcMar>
-          </w:tcPr>
-          <w:p>
-            <w:pPr>
-              <w:spacing w:after="20" w:line="252" w:lineRule="auto"/>
-            </w:pPr>
-            <w:r>
-              <w:rPr>
-                <w:sz w:val="17"/>
-                <w:szCs w:val="17"/>
-              </w:rPr>
+            <w:tcW w:type="dxa" w:w="4307"/>
+          </w:tcPr>
+          <w:p>
+            <w:r>
+              <w:t>MED-3 Project proposal and scope (Section 1)</w:t>
+            </w:r>
+          </w:p>
+        </w:tc>
+        <w:tc>
+          <w:tcPr>
+            <w:tcW w:type="dxa" w:w="1435"/>
+          </w:tcPr>
+          <w:p>
+            <w:r>
               <w:t>Nuray</w:t>
             </w:r>
           </w:p>
         </w:tc>
         <w:tc>
           <w:tcPr>
-            <w:tcW w:w="923" w:type="dxa"/>
-            <w:tcBorders>
-              <w:top w:val="single" w:sz="4" w:space="0" w:color="A6B4C4"/>
-              <w:left w:val="single" w:sz="4" w:space="0" w:color="A6B4C4"/>
-              <w:bottom w:val="single" w:sz="4" w:space="0" w:color="A6B4C4"/>
-              <w:right w:val="single" w:sz="4" w:space="0" w:color="A6B4C4"/>
-            </w:tcBorders>
-            <w:tcMar>
-              <w:top w:w="50" w:type="dxa"/>
-              <w:left w:w="90" w:type="dxa"/>
-              <w:bottom w:w="50" w:type="dxa"/>
-              <w:right w:w="90" w:type="dxa"/>
-            </w:tcMar>
-          </w:tcPr>
-          <w:p>
-            <w:pPr>
-              <w:spacing w:after="20" w:line="252" w:lineRule="auto"/>
-            </w:pPr>
-            <w:r>
-              <w:rPr>
-                <w:sz w:val="17"/>
-                <w:szCs w:val="17"/>
-              </w:rPr>
-              <w:t>20 Oct</w:t>
-            </w:r>
-          </w:p>
-        </w:tc>
-        <w:tc>
-          <w:tcPr>
-            <w:tcW w:w="2361" w:type="dxa"/>
-            <w:tcBorders>
-              <w:top w:val="single" w:sz="4" w:space="0" w:color="A6B4C4"/>
-              <w:left w:val="single" w:sz="4" w:space="0" w:color="A6B4C4"/>
-              <w:bottom w:val="single" w:sz="4" w:space="0" w:color="A6B4C4"/>
-              <w:right w:val="single" w:sz="4" w:space="0" w:color="A6B4C4"/>
-            </w:tcBorders>
-            <w:tcMar>
-              <w:top w:w="50" w:type="dxa"/>
-              <w:left w:w="90" w:type="dxa"/>
-              <w:bottom w:w="50" w:type="dxa"/>
-              <w:right w:w="90" w:type="dxa"/>
-            </w:tcMar>
-          </w:tcPr>
-          <w:p>
-            <w:pPr>
-              <w:spacing w:after="20" w:line="252" w:lineRule="auto"/>
-            </w:pPr>
-            <w:r>
-              <w:rPr>
-                <w:sz w:val="17"/>
-                <w:szCs w:val="17"/>
-              </w:rPr>
-              <w:t>Reviewed by supervisor</w:t>
+            <w:tcW w:type="dxa" w:w="923"/>
+          </w:tcPr>
+          <w:p>
+            <w:r>
+              <w:t>18 Oct 2026</w:t>
+            </w:r>
+          </w:p>
+        </w:tc>
+        <w:tc>
+          <w:tcPr>
+            <w:tcW w:type="dxa" w:w="2361"/>
+          </w:tcPr>
+          <w:p>
+            <w:r>
+              <w:t>Updated proposal aligned with MedGuard scope; supervisor review pending</w:t>
             </w:r>
           </w:p>
         </w:tc>
@@ -1407,103 +1100,41 @@
         </w:trPr>
         <w:tc>
           <w:tcPr>
-            <w:tcW w:w="4307" w:type="dxa"/>
-            <w:tcBorders>
-              <w:top w:val="single" w:sz="4" w:space="0" w:color="A6B4C4"/>
-              <w:left w:val="single" w:sz="4" w:space="0" w:color="A6B4C4"/>
-              <w:bottom w:val="single" w:sz="4" w:space="0" w:color="A6B4C4"/>
-              <w:right w:val="single" w:sz="4" w:space="0" w:color="A6B4C4"/>
-            </w:tcBorders>
-            <w:tcMar>
-              <w:top w:w="50" w:type="dxa"/>
-              <w:left w:w="90" w:type="dxa"/>
-              <w:bottom w:w="50" w:type="dxa"/>
-              <w:right w:w="90" w:type="dxa"/>
-            </w:tcMar>
-          </w:tcPr>
-          <w:p>
-            <w:r>
-              <w:t>MSA-4 Physician interview P1 and evidence of relevance (Section 2)</w:t>
-            </w:r>
-          </w:p>
-        </w:tc>
-        <w:tc>
-          <w:tcPr>
-            <w:tcW w:w="1435" w:type="dxa"/>
-            <w:tcBorders>
-              <w:top w:val="single" w:sz="4" w:space="0" w:color="A6B4C4"/>
-              <w:left w:val="single" w:sz="4" w:space="0" w:color="A6B4C4"/>
-              <w:bottom w:val="single" w:sz="4" w:space="0" w:color="A6B4C4"/>
-              <w:right w:val="single" w:sz="4" w:space="0" w:color="A6B4C4"/>
-            </w:tcBorders>
-            <w:tcMar>
-              <w:top w:w="50" w:type="dxa"/>
-              <w:left w:w="90" w:type="dxa"/>
-              <w:bottom w:w="50" w:type="dxa"/>
-              <w:right w:w="90" w:type="dxa"/>
-            </w:tcMar>
-          </w:tcPr>
-          <w:p>
-            <w:pPr>
-              <w:spacing w:after="20" w:line="252" w:lineRule="auto"/>
-            </w:pPr>
-            <w:r>
-              <w:rPr>
-                <w:sz w:val="17"/>
-                <w:szCs w:val="17"/>
-              </w:rPr>
-              <w:t>Aknur</w:t>
-            </w:r>
-          </w:p>
-        </w:tc>
-        <w:tc>
-          <w:tcPr>
-            <w:tcW w:w="923" w:type="dxa"/>
-            <w:tcBorders>
-              <w:top w:val="single" w:sz="4" w:space="0" w:color="A6B4C4"/>
-              <w:left w:val="single" w:sz="4" w:space="0" w:color="A6B4C4"/>
-              <w:bottom w:val="single" w:sz="4" w:space="0" w:color="A6B4C4"/>
-              <w:right w:val="single" w:sz="4" w:space="0" w:color="A6B4C4"/>
-            </w:tcBorders>
-            <w:tcMar>
-              <w:top w:w="50" w:type="dxa"/>
-              <w:left w:w="90" w:type="dxa"/>
-              <w:bottom w:w="50" w:type="dxa"/>
-              <w:right w:w="90" w:type="dxa"/>
-            </w:tcMar>
-          </w:tcPr>
-          <w:p>
-            <w:pPr>
-              <w:spacing w:after="20" w:line="252" w:lineRule="auto"/>
-            </w:pPr>
-            <w:r>
-              <w:rPr>
-                <w:sz w:val="17"/>
-                <w:szCs w:val="17"/>
-              </w:rPr>
-              <w:t>23 Oct</w:t>
-            </w:r>
-          </w:p>
-        </w:tc>
-        <w:tc>
-          <w:tcPr>
-            <w:tcW w:w="2361" w:type="dxa"/>
-            <w:tcBorders>
-              <w:top w:val="single" w:sz="4" w:space="0" w:color="A6B4C4"/>
-              <w:left w:val="single" w:sz="4" w:space="0" w:color="A6B4C4"/>
-              <w:bottom w:val="single" w:sz="4" w:space="0" w:color="A6B4C4"/>
-              <w:right w:val="single" w:sz="4" w:space="0" w:color="A6B4C4"/>
-            </w:tcBorders>
-            <w:tcMar>
-              <w:top w:w="50" w:type="dxa"/>
-              <w:left w:w="90" w:type="dxa"/>
-              <w:bottom w:w="50" w:type="dxa"/>
-              <w:right w:w="90" w:type="dxa"/>
-            </w:tcMar>
-          </w:tcPr>
-          <w:p>
-            <w:r>
-              <w:t>Anonymised P1 interview and evidence table; signed consent held outside repository</w:t>
+            <w:tcW w:type="dxa" w:w="4307"/>
+          </w:tcPr>
+          <w:p>
+            <w:r>
+              <w:t>MED-4 Conduct interviews with potential users</w:t>
+            </w:r>
+          </w:p>
+        </w:tc>
+        <w:tc>
+          <w:tcPr>
+            <w:tcW w:type="dxa" w:w="1435"/>
+          </w:tcPr>
+          <w:p>
+            <w:r>
+              <w:t>Nuray</w:t>
+            </w:r>
+          </w:p>
+        </w:tc>
+        <w:tc>
+          <w:tcPr>
+            <w:tcW w:type="dxa" w:w="923"/>
+          </w:tcPr>
+          <w:p>
+            <w:r>
+              <w:t>22 Oct 2026</w:t>
+            </w:r>
+          </w:p>
+        </w:tc>
+        <w:tc>
+          <w:tcPr>
+            <w:tcW w:type="dxa" w:w="2361"/>
+          </w:tcPr>
+          <w:p>
+            <w:r>
+              <w:t>Interview activity documented; distinguish task assignee from interview author</w:t>
             </w:r>
           </w:p>
         </w:tc>
@@ -1514,117 +1145,41 @@
         </w:trPr>
         <w:tc>
           <w:tcPr>
-            <w:tcW w:w="4307" w:type="dxa"/>
-            <w:tcBorders>
-              <w:top w:val="single" w:sz="4" w:space="0" w:color="A6B4C4"/>
-              <w:left w:val="single" w:sz="4" w:space="0" w:color="A6B4C4"/>
-              <w:bottom w:val="single" w:sz="4" w:space="0" w:color="A6B4C4"/>
-              <w:right w:val="single" w:sz="4" w:space="0" w:color="A6B4C4"/>
-            </w:tcBorders>
-            <w:tcMar>
-              <w:top w:w="50" w:type="dxa"/>
-              <w:left w:w="90" w:type="dxa"/>
-              <w:bottom w:w="50" w:type="dxa"/>
-              <w:right w:w="90" w:type="dxa"/>
-            </w:tcMar>
-          </w:tcPr>
-          <w:p>
-            <w:pPr>
-              <w:spacing w:after="20" w:line="252" w:lineRule="auto"/>
-            </w:pPr>
-            <w:r>
-              <w:rPr>
-                <w:sz w:val="17"/>
-                <w:szCs w:val="17"/>
-              </w:rPr>
-              <w:t>MSA-5 Literature review and analysis table</w:t>
-            </w:r>
-          </w:p>
-        </w:tc>
-        <w:tc>
-          <w:tcPr>
-            <w:tcW w:w="1435" w:type="dxa"/>
-            <w:tcBorders>
-              <w:top w:val="single" w:sz="4" w:space="0" w:color="A6B4C4"/>
-              <w:left w:val="single" w:sz="4" w:space="0" w:color="A6B4C4"/>
-              <w:bottom w:val="single" w:sz="4" w:space="0" w:color="A6B4C4"/>
-              <w:right w:val="single" w:sz="4" w:space="0" w:color="A6B4C4"/>
-            </w:tcBorders>
-            <w:tcMar>
-              <w:top w:w="50" w:type="dxa"/>
-              <w:left w:w="90" w:type="dxa"/>
-              <w:bottom w:w="50" w:type="dxa"/>
-              <w:right w:w="90" w:type="dxa"/>
-            </w:tcMar>
-          </w:tcPr>
-          <w:p>
-            <w:pPr>
-              <w:spacing w:after="20" w:line="252" w:lineRule="auto"/>
-            </w:pPr>
-            <w:r>
-              <w:rPr>
-                <w:sz w:val="17"/>
-                <w:szCs w:val="17"/>
-              </w:rPr>
+            <w:tcW w:type="dxa" w:w="4307"/>
+          </w:tcPr>
+          <w:p>
+            <w:r>
+              <w:t>MED-5 Literature review and analysis table</w:t>
+            </w:r>
+          </w:p>
+        </w:tc>
+        <w:tc>
+          <w:tcPr>
+            <w:tcW w:type="dxa" w:w="1435"/>
+          </w:tcPr>
+          <w:p>
+            <w:r>
               <w:t>Altynay</w:t>
             </w:r>
           </w:p>
         </w:tc>
         <w:tc>
           <w:tcPr>
-            <w:tcW w:w="923" w:type="dxa"/>
-            <w:tcBorders>
-              <w:top w:val="single" w:sz="4" w:space="0" w:color="A6B4C4"/>
-              <w:left w:val="single" w:sz="4" w:space="0" w:color="A6B4C4"/>
-              <w:bottom w:val="single" w:sz="4" w:space="0" w:color="A6B4C4"/>
-              <w:right w:val="single" w:sz="4" w:space="0" w:color="A6B4C4"/>
-            </w:tcBorders>
-            <w:tcMar>
-              <w:top w:w="50" w:type="dxa"/>
-              <w:left w:w="90" w:type="dxa"/>
-              <w:bottom w:w="50" w:type="dxa"/>
-              <w:right w:w="90" w:type="dxa"/>
-            </w:tcMar>
-          </w:tcPr>
-          <w:p>
-            <w:pPr>
-              <w:spacing w:after="20" w:line="252" w:lineRule="auto"/>
-            </w:pPr>
-            <w:r>
-              <w:rPr>
-                <w:sz w:val="17"/>
-                <w:szCs w:val="17"/>
-              </w:rPr>
-              <w:t>21 Oct</w:t>
-            </w:r>
-          </w:p>
-        </w:tc>
-        <w:tc>
-          <w:tcPr>
-            <w:tcW w:w="2361" w:type="dxa"/>
-            <w:tcBorders>
-              <w:top w:val="single" w:sz="4" w:space="0" w:color="A6B4C4"/>
-              <w:left w:val="single" w:sz="4" w:space="0" w:color="A6B4C4"/>
-              <w:bottom w:val="single" w:sz="4" w:space="0" w:color="A6B4C4"/>
-              <w:right w:val="single" w:sz="4" w:space="0" w:color="A6B4C4"/>
-            </w:tcBorders>
-            <w:tcMar>
-              <w:top w:w="50" w:type="dxa"/>
-              <w:left w:w="90" w:type="dxa"/>
-              <w:bottom w:w="50" w:type="dxa"/>
-              <w:right w:w="90" w:type="dxa"/>
-            </w:tcMar>
-          </w:tcPr>
-          <w:p>
-            <w:pPr>
-              <w:spacing w:after="20" w:line="252" w:lineRule="auto"/>
-            </w:pPr>
-            <w:r>
-              <w:rPr>
-                <w:sz w:val="17"/>
-                <w:szCs w:val="17"/>
-              </w:rPr>
-              <w:t>≥ 12 sources, ≥ 8 scientific, table complete</w:t>
+            <w:tcW w:type="dxa" w:w="923"/>
+          </w:tcPr>
+          <w:p>
+            <w:r>
+              <w:t>20 Oct 2026</w:t>
+            </w:r>
+          </w:p>
+        </w:tc>
+        <w:tc>
+          <w:tcPr>
+            <w:tcW w:type="dxa" w:w="2361"/>
+          </w:tcPr>
+          <w:p>
+            <w:r>
+              <w:t>Source list and comparison table</w:t>
             </w:r>
           </w:p>
         </w:tc>
@@ -1635,117 +1190,41 @@
         </w:trPr>
         <w:tc>
           <w:tcPr>
-            <w:tcW w:w="4307" w:type="dxa"/>
-            <w:tcBorders>
-              <w:top w:val="single" w:sz="4" w:space="0" w:color="A6B4C4"/>
-              <w:left w:val="single" w:sz="4" w:space="0" w:color="A6B4C4"/>
-              <w:bottom w:val="single" w:sz="4" w:space="0" w:color="A6B4C4"/>
-              <w:right w:val="single" w:sz="4" w:space="0" w:color="A6B4C4"/>
-            </w:tcBorders>
-            <w:tcMar>
-              <w:top w:w="50" w:type="dxa"/>
-              <w:left w:w="90" w:type="dxa"/>
-              <w:bottom w:w="50" w:type="dxa"/>
-              <w:right w:w="90" w:type="dxa"/>
-            </w:tcMar>
-          </w:tcPr>
-          <w:p>
-            <w:pPr>
-              <w:spacing w:after="20" w:line="252" w:lineRule="auto"/>
-            </w:pPr>
-            <w:r>
-              <w:rPr>
-                <w:sz w:val="17"/>
-                <w:szCs w:val="17"/>
-              </w:rPr>
-              <w:t>MSA-6 Existing system comparison</w:t>
-            </w:r>
-          </w:p>
-        </w:tc>
-        <w:tc>
-          <w:tcPr>
-            <w:tcW w:w="1435" w:type="dxa"/>
-            <w:tcBorders>
-              <w:top w:val="single" w:sz="4" w:space="0" w:color="A6B4C4"/>
-              <w:left w:val="single" w:sz="4" w:space="0" w:color="A6B4C4"/>
-              <w:bottom w:val="single" w:sz="4" w:space="0" w:color="A6B4C4"/>
-              <w:right w:val="single" w:sz="4" w:space="0" w:color="A6B4C4"/>
-            </w:tcBorders>
-            <w:tcMar>
-              <w:top w:w="50" w:type="dxa"/>
-              <w:left w:w="90" w:type="dxa"/>
-              <w:bottom w:w="50" w:type="dxa"/>
-              <w:right w:w="90" w:type="dxa"/>
-            </w:tcMar>
-          </w:tcPr>
-          <w:p>
-            <w:pPr>
-              <w:spacing w:after="20" w:line="252" w:lineRule="auto"/>
-            </w:pPr>
-            <w:r>
-              <w:rPr>
-                <w:sz w:val="17"/>
-                <w:szCs w:val="17"/>
-              </w:rPr>
+            <w:tcW w:type="dxa" w:w="4307"/>
+          </w:tcPr>
+          <w:p>
+            <w:r>
+              <w:t>MED-6 Existing system comparison (Section 4)</w:t>
+            </w:r>
+          </w:p>
+        </w:tc>
+        <w:tc>
+          <w:tcPr>
+            <w:tcW w:type="dxa" w:w="1435"/>
+          </w:tcPr>
+          <w:p>
+            <w:r>
               <w:t>Nuray</w:t>
             </w:r>
           </w:p>
         </w:tc>
         <w:tc>
           <w:tcPr>
-            <w:tcW w:w="923" w:type="dxa"/>
-            <w:tcBorders>
-              <w:top w:val="single" w:sz="4" w:space="0" w:color="A6B4C4"/>
-              <w:left w:val="single" w:sz="4" w:space="0" w:color="A6B4C4"/>
-              <w:bottom w:val="single" w:sz="4" w:space="0" w:color="A6B4C4"/>
-              <w:right w:val="single" w:sz="4" w:space="0" w:color="A6B4C4"/>
-            </w:tcBorders>
-            <w:tcMar>
-              <w:top w:w="50" w:type="dxa"/>
-              <w:left w:w="90" w:type="dxa"/>
-              <w:bottom w:w="50" w:type="dxa"/>
-              <w:right w:w="90" w:type="dxa"/>
-            </w:tcMar>
-          </w:tcPr>
-          <w:p>
-            <w:pPr>
-              <w:spacing w:after="20" w:line="252" w:lineRule="auto"/>
-            </w:pPr>
-            <w:r>
-              <w:rPr>
-                <w:sz w:val="17"/>
-                <w:szCs w:val="17"/>
-              </w:rPr>
-              <w:t>21 Oct</w:t>
-            </w:r>
-          </w:p>
-        </w:tc>
-        <w:tc>
-          <w:tcPr>
-            <w:tcW w:w="2361" w:type="dxa"/>
-            <w:tcBorders>
-              <w:top w:val="single" w:sz="4" w:space="0" w:color="A6B4C4"/>
-              <w:left w:val="single" w:sz="4" w:space="0" w:color="A6B4C4"/>
-              <w:bottom w:val="single" w:sz="4" w:space="0" w:color="A6B4C4"/>
-              <w:right w:val="single" w:sz="4" w:space="0" w:color="A6B4C4"/>
-            </w:tcBorders>
-            <w:tcMar>
-              <w:top w:w="50" w:type="dxa"/>
-              <w:left w:w="90" w:type="dxa"/>
-              <w:bottom w:w="50" w:type="dxa"/>
-              <w:right w:w="90" w:type="dxa"/>
-            </w:tcMar>
-          </w:tcPr>
-          <w:p>
-            <w:pPr>
-              <w:spacing w:after="20" w:line="252" w:lineRule="auto"/>
-            </w:pPr>
-            <w:r>
-              <w:rPr>
-                <w:sz w:val="17"/>
-                <w:szCs w:val="17"/>
-              </w:rPr>
-              <w:t>5 systems × 10 criteria with source links</w:t>
+            <w:tcW w:type="dxa" w:w="923"/>
+          </w:tcPr>
+          <w:p>
+            <w:r>
+              <w:t>20 Oct 2026</w:t>
+            </w:r>
+          </w:p>
+        </w:tc>
+        <w:tc>
+          <w:tcPr>
+            <w:tcW w:type="dxa" w:w="2361"/>
+          </w:tcPr>
+          <w:p>
+            <w:r>
+              <w:t>Five systems compared using ten criteria and sources</w:t>
             </w:r>
           </w:p>
         </w:tc>
@@ -1756,113 +1235,41 @@
         </w:trPr>
         <w:tc>
           <w:tcPr>
-            <w:tcW w:w="4307" w:type="dxa"/>
-            <w:tcBorders>
-              <w:top w:val="single" w:sz="4" w:space="0" w:color="A6B4C4"/>
-              <w:left w:val="single" w:sz="4" w:space="0" w:color="A6B4C4"/>
-              <w:bottom w:val="single" w:sz="4" w:space="0" w:color="A6B4C4"/>
-              <w:right w:val="single" w:sz="4" w:space="0" w:color="A6B4C4"/>
-            </w:tcBorders>
-            <w:tcMar>
-              <w:top w:w="50" w:type="dxa"/>
-              <w:left w:w="90" w:type="dxa"/>
-              <w:bottom w:w="50" w:type="dxa"/>
-              <w:right w:w="90" w:type="dxa"/>
-            </w:tcMar>
-          </w:tcPr>
-          <w:p>
-            <w:r>
-              <w:t>MSA-7 Technology comparison and architecture decisions</w:t>
-            </w:r>
-          </w:p>
-        </w:tc>
-        <w:tc>
-          <w:tcPr>
-            <w:tcW w:w="1435" w:type="dxa"/>
-            <w:tcBorders>
-              <w:top w:val="single" w:sz="4" w:space="0" w:color="A6B4C4"/>
-              <w:left w:val="single" w:sz="4" w:space="0" w:color="A6B4C4"/>
-              <w:bottom w:val="single" w:sz="4" w:space="0" w:color="A6B4C4"/>
-              <w:right w:val="single" w:sz="4" w:space="0" w:color="A6B4C4"/>
-            </w:tcBorders>
-            <w:tcMar>
-              <w:top w:w="50" w:type="dxa"/>
-              <w:left w:w="90" w:type="dxa"/>
-              <w:bottom w:w="50" w:type="dxa"/>
-              <w:right w:w="90" w:type="dxa"/>
-            </w:tcMar>
-          </w:tcPr>
-          <w:p>
-            <w:pPr>
-              <w:spacing w:after="20" w:line="252" w:lineRule="auto"/>
-              <w:rPr>
-                <w:lang w:val="en-US"/>
-              </w:rPr>
-            </w:pPr>
-            <w:r>
-              <w:rPr>
-                <w:sz w:val="17"/>
-                <w:szCs w:val="17"/>
-              </w:rPr>
+            <w:tcW w:type="dxa" w:w="4307"/>
+          </w:tcPr>
+          <w:p>
+            <w:r>
+              <w:t>MED-7 Technology comparison and ADRs (Section 5)</w:t>
+            </w:r>
+          </w:p>
+        </w:tc>
+        <w:tc>
+          <w:tcPr>
+            <w:tcW w:type="dxa" w:w="1435"/>
+          </w:tcPr>
+          <w:p>
+            <w:r>
               <w:t>Nuray</w:t>
             </w:r>
           </w:p>
         </w:tc>
         <w:tc>
           <w:tcPr>
-            <w:tcW w:w="923" w:type="dxa"/>
-            <w:tcBorders>
-              <w:top w:val="single" w:sz="4" w:space="0" w:color="A6B4C4"/>
-              <w:left w:val="single" w:sz="4" w:space="0" w:color="A6B4C4"/>
-              <w:bottom w:val="single" w:sz="4" w:space="0" w:color="A6B4C4"/>
-              <w:right w:val="single" w:sz="4" w:space="0" w:color="A6B4C4"/>
-            </w:tcBorders>
-            <w:tcMar>
-              <w:top w:w="50" w:type="dxa"/>
-              <w:left w:w="90" w:type="dxa"/>
-              <w:bottom w:w="50" w:type="dxa"/>
-              <w:right w:w="90" w:type="dxa"/>
-            </w:tcMar>
-          </w:tcPr>
-          <w:p>
-            <w:pPr>
-              <w:spacing w:after="20" w:line="252" w:lineRule="auto"/>
-            </w:pPr>
-            <w:r>
-              <w:rPr>
-                <w:sz w:val="17"/>
-                <w:szCs w:val="17"/>
-              </w:rPr>
-              <w:t>21 Oct</w:t>
-            </w:r>
-          </w:p>
-        </w:tc>
-        <w:tc>
-          <w:tcPr>
-            <w:tcW w:w="2361" w:type="dxa"/>
-            <w:tcBorders>
-              <w:top w:val="single" w:sz="4" w:space="0" w:color="A6B4C4"/>
-              <w:left w:val="single" w:sz="4" w:space="0" w:color="A6B4C4"/>
-              <w:bottom w:val="single" w:sz="4" w:space="0" w:color="A6B4C4"/>
-              <w:right w:val="single" w:sz="4" w:space="0" w:color="A6B4C4"/>
-            </w:tcBorders>
-            <w:tcMar>
-              <w:top w:w="50" w:type="dxa"/>
-              <w:left w:w="90" w:type="dxa"/>
-              <w:bottom w:w="50" w:type="dxa"/>
-              <w:right w:w="90" w:type="dxa"/>
-            </w:tcMar>
-          </w:tcPr>
-          <w:p>
-            <w:pPr>
-              <w:spacing w:after="20" w:line="252" w:lineRule="auto"/>
-            </w:pPr>
-            <w:r>
-              <w:rPr>
-                <w:sz w:val="17"/>
-                <w:szCs w:val="17"/>
-              </w:rPr>
-              <w:t>6 decisions documented as ADRs</w:t>
+            <w:tcW w:type="dxa" w:w="923"/>
+          </w:tcPr>
+          <w:p>
+            <w:r>
+              <w:t>20 Oct 2026</w:t>
+            </w:r>
+          </w:p>
+        </w:tc>
+        <w:tc>
+          <w:tcPr>
+            <w:tcW w:type="dxa" w:w="2361"/>
+          </w:tcPr>
+          <w:p>
+            <w:r>
+              <w:t>Six technology decisions and rationale</w:t>
             </w:r>
           </w:p>
         </w:tc>
@@ -1873,103 +1280,41 @@
         </w:trPr>
         <w:tc>
           <w:tcPr>
-            <w:tcW w:w="4307" w:type="dxa"/>
-            <w:tcBorders>
-              <w:top w:val="single" w:sz="4" w:space="0" w:color="A6B4C4"/>
-              <w:left w:val="single" w:sz="4" w:space="0" w:color="A6B4C4"/>
-              <w:bottom w:val="single" w:sz="4" w:space="0" w:color="A6B4C4"/>
-              <w:right w:val="single" w:sz="4" w:space="0" w:color="A6B4C4"/>
-            </w:tcBorders>
-            <w:tcMar>
-              <w:top w:w="50" w:type="dxa"/>
-              <w:left w:w="90" w:type="dxa"/>
-              <w:bottom w:w="50" w:type="dxa"/>
-              <w:right w:w="90" w:type="dxa"/>
-            </w:tcMar>
-          </w:tcPr>
-          <w:p>
-            <w:r>
-              <w:t>MSA-8 Requirements specification and acceptance criteria (MED-8)</w:t>
-            </w:r>
-          </w:p>
-        </w:tc>
-        <w:tc>
-          <w:tcPr>
-            <w:tcW w:w="1435" w:type="dxa"/>
-            <w:tcBorders>
-              <w:top w:val="single" w:sz="4" w:space="0" w:color="A6B4C4"/>
-              <w:left w:val="single" w:sz="4" w:space="0" w:color="A6B4C4"/>
-              <w:bottom w:val="single" w:sz="4" w:space="0" w:color="A6B4C4"/>
-              <w:right w:val="single" w:sz="4" w:space="0" w:color="A6B4C4"/>
-            </w:tcBorders>
-            <w:tcMar>
-              <w:top w:w="50" w:type="dxa"/>
-              <w:left w:w="90" w:type="dxa"/>
-              <w:bottom w:w="50" w:type="dxa"/>
-              <w:right w:w="90" w:type="dxa"/>
-            </w:tcMar>
-          </w:tcPr>
-          <w:p>
-            <w:pPr>
-              <w:spacing w:after="20" w:line="252" w:lineRule="auto"/>
-            </w:pPr>
-            <w:r>
-              <w:rPr>
-                <w:sz w:val="17"/>
-                <w:szCs w:val="17"/>
-              </w:rPr>
-              <w:t>Aknur</w:t>
-            </w:r>
-          </w:p>
-        </w:tc>
-        <w:tc>
-          <w:tcPr>
-            <w:tcW w:w="923" w:type="dxa"/>
-            <w:tcBorders>
-              <w:top w:val="single" w:sz="4" w:space="0" w:color="A6B4C4"/>
-              <w:left w:val="single" w:sz="4" w:space="0" w:color="A6B4C4"/>
-              <w:bottom w:val="single" w:sz="4" w:space="0" w:color="A6B4C4"/>
-              <w:right w:val="single" w:sz="4" w:space="0" w:color="A6B4C4"/>
-            </w:tcBorders>
-            <w:tcMar>
-              <w:top w:w="50" w:type="dxa"/>
-              <w:left w:w="90" w:type="dxa"/>
-              <w:bottom w:w="50" w:type="dxa"/>
-              <w:right w:w="90" w:type="dxa"/>
-            </w:tcMar>
-          </w:tcPr>
-          <w:p>
-            <w:pPr>
-              <w:spacing w:after="20" w:line="252" w:lineRule="auto"/>
-            </w:pPr>
-            <w:r>
-              <w:rPr>
-                <w:sz w:val="17"/>
-                <w:szCs w:val="17"/>
-              </w:rPr>
-              <w:t>22 Oct</w:t>
-            </w:r>
-          </w:p>
-        </w:tc>
-        <w:tc>
-          <w:tcPr>
-            <w:tcW w:w="2361" w:type="dxa"/>
-            <w:tcBorders>
-              <w:top w:val="single" w:sz="4" w:space="0" w:color="A6B4C4"/>
-              <w:left w:val="single" w:sz="4" w:space="0" w:color="A6B4C4"/>
-              <w:bottom w:val="single" w:sz="4" w:space="0" w:color="A6B4C4"/>
-              <w:right w:val="single" w:sz="4" w:space="0" w:color="A6B4C4"/>
-            </w:tcBorders>
-            <w:tcMar>
-              <w:top w:w="50" w:type="dxa"/>
-              <w:left w:w="90" w:type="dxa"/>
-              <w:bottom w:w="50" w:type="dxa"/>
-              <w:right w:w="90" w:type="dxa"/>
-            </w:tcMar>
-          </w:tcPr>
-          <w:p>
-            <w:r>
-              <w:t>FR-01–FR-46 and NFR-01–NFR-22; role and privacy constraints reviewed</w:t>
+            <w:tcW w:type="dxa" w:w="4307"/>
+          </w:tcPr>
+          <w:p>
+            <w:r>
+              <w:t>MED-8 Requirements specification with acceptance criteria</w:t>
+            </w:r>
+          </w:p>
+        </w:tc>
+        <w:tc>
+          <w:tcPr>
+            <w:tcW w:type="dxa" w:w="1435"/>
+          </w:tcPr>
+          <w:p>
+            <w:r>
+              <w:t>Nuray</w:t>
+            </w:r>
+          </w:p>
+        </w:tc>
+        <w:tc>
+          <w:tcPr>
+            <w:tcW w:type="dxa" w:w="923"/>
+          </w:tcPr>
+          <w:p>
+            <w:r>
+              <w:t>21 Oct 2026</w:t>
+            </w:r>
+          </w:p>
+        </w:tc>
+        <w:tc>
+          <w:tcPr>
+            <w:tcW w:type="dxa" w:w="2361"/>
+          </w:tcPr>
+          <w:p>
+            <w:r>
+              <w:t>FR-01–FR-46; NFR-01–NFR-22; task assignee per YouTrack</w:t>
             </w:r>
           </w:p>
         </w:tc>
@@ -1980,107 +1325,41 @@
         </w:trPr>
         <w:tc>
           <w:tcPr>
-            <w:tcW w:w="4307" w:type="dxa"/>
-            <w:tcBorders>
-              <w:top w:val="single" w:sz="4" w:space="0" w:color="A6B4C4"/>
-              <w:left w:val="single" w:sz="4" w:space="0" w:color="A6B4C4"/>
-              <w:bottom w:val="single" w:sz="4" w:space="0" w:color="A6B4C4"/>
-              <w:right w:val="single" w:sz="4" w:space="0" w:color="A6B4C4"/>
-            </w:tcBorders>
-            <w:tcMar>
-              <w:top w:w="50" w:type="dxa"/>
-              <w:left w:w="90" w:type="dxa"/>
-              <w:bottom w:w="50" w:type="dxa"/>
-              <w:right w:w="90" w:type="dxa"/>
-            </w:tcMar>
-          </w:tcPr>
-          <w:p>
-            <w:r>
-              <w:lastRenderedPageBreak/>
-              <w:t>MSA-9 Context, component and use-case diagrams (MED-13, MED-17)</w:t>
-            </w:r>
-          </w:p>
-        </w:tc>
-        <w:tc>
-          <w:tcPr>
-            <w:tcW w:w="1435" w:type="dxa"/>
-            <w:tcBorders>
-              <w:top w:val="single" w:sz="4" w:space="0" w:color="A6B4C4"/>
-              <w:left w:val="single" w:sz="4" w:space="0" w:color="A6B4C4"/>
-              <w:bottom w:val="single" w:sz="4" w:space="0" w:color="A6B4C4"/>
-              <w:right w:val="single" w:sz="4" w:space="0" w:color="A6B4C4"/>
-            </w:tcBorders>
-            <w:tcMar>
-              <w:top w:w="50" w:type="dxa"/>
-              <w:left w:w="90" w:type="dxa"/>
-              <w:bottom w:w="50" w:type="dxa"/>
-              <w:right w:w="90" w:type="dxa"/>
-            </w:tcMar>
-          </w:tcPr>
-          <w:p>
-            <w:pPr>
-              <w:spacing w:after="20" w:line="252" w:lineRule="auto"/>
-              <w:rPr>
-                <w:lang w:val="en-US"/>
-              </w:rPr>
-            </w:pPr>
-            <w:r>
-              <w:rPr>
-                <w:sz w:val="17"/>
-                <w:szCs w:val="17"/>
-              </w:rPr>
+            <w:tcW w:type="dxa" w:w="4307"/>
+          </w:tcPr>
+          <w:p>
+            <w:r>
+              <w:t>MED-9 System context and component diagrams</w:t>
+            </w:r>
+          </w:p>
+        </w:tc>
+        <w:tc>
+          <w:tcPr>
+            <w:tcW w:type="dxa" w:w="1435"/>
+          </w:tcPr>
+          <w:p>
+            <w:r>
               <w:t>Altynay</w:t>
             </w:r>
           </w:p>
         </w:tc>
         <w:tc>
           <w:tcPr>
-            <w:tcW w:w="923" w:type="dxa"/>
-            <w:tcBorders>
-              <w:top w:val="single" w:sz="4" w:space="0" w:color="A6B4C4"/>
-              <w:left w:val="single" w:sz="4" w:space="0" w:color="A6B4C4"/>
-              <w:bottom w:val="single" w:sz="4" w:space="0" w:color="A6B4C4"/>
-              <w:right w:val="single" w:sz="4" w:space="0" w:color="A6B4C4"/>
-            </w:tcBorders>
-            <w:tcMar>
-              <w:top w:w="50" w:type="dxa"/>
-              <w:left w:w="90" w:type="dxa"/>
-              <w:bottom w:w="50" w:type="dxa"/>
-              <w:right w:w="90" w:type="dxa"/>
-            </w:tcMar>
-          </w:tcPr>
-          <w:p>
-            <w:pPr>
-              <w:spacing w:after="20" w:line="252" w:lineRule="auto"/>
-            </w:pPr>
-            <w:r>
-              <w:rPr>
-                <w:sz w:val="17"/>
-                <w:szCs w:val="17"/>
-              </w:rPr>
-              <w:t>22 Oct</w:t>
-            </w:r>
-          </w:p>
-        </w:tc>
-        <w:tc>
-          <w:tcPr>
-            <w:tcW w:w="2361" w:type="dxa"/>
-            <w:tcBorders>
-              <w:top w:val="single" w:sz="4" w:space="0" w:color="A6B4C4"/>
-              <w:left w:val="single" w:sz="4" w:space="0" w:color="A6B4C4"/>
-              <w:bottom w:val="single" w:sz="4" w:space="0" w:color="A6B4C4"/>
-              <w:right w:val="single" w:sz="4" w:space="0" w:color="A6B4C4"/>
-            </w:tcBorders>
-            <w:tcMar>
-              <w:top w:w="50" w:type="dxa"/>
-              <w:left w:w="90" w:type="dxa"/>
-              <w:bottom w:w="50" w:type="dxa"/>
-              <w:right w:w="90" w:type="dxa"/>
-            </w:tcMar>
-          </w:tcPr>
-          <w:p>
-            <w:r>
-              <w:t>Editable sources plus PNG/SVG exports; three human roles and current components</w:t>
+            <w:tcW w:type="dxa" w:w="923"/>
+          </w:tcPr>
+          <w:p>
+            <w:r>
+              <w:t>21 Oct 2026</w:t>
+            </w:r>
+          </w:p>
+        </w:tc>
+        <w:tc>
+          <w:tcPr>
+            <w:tcW w:type="dxa" w:w="2361"/>
+          </w:tcPr>
+          <w:p>
+            <w:r>
+              <w:t>Editable sources and image exports</w:t>
             </w:r>
           </w:p>
         </w:tc>
@@ -2091,106 +1370,41 @@
         </w:trPr>
         <w:tc>
           <w:tcPr>
-            <w:tcW w:w="4307" w:type="dxa"/>
-            <w:tcBorders>
-              <w:top w:val="single" w:sz="4" w:space="0" w:color="A6B4C4"/>
-              <w:left w:val="single" w:sz="4" w:space="0" w:color="A6B4C4"/>
-              <w:bottom w:val="single" w:sz="4" w:space="0" w:color="A6B4C4"/>
-              <w:right w:val="single" w:sz="4" w:space="0" w:color="A6B4C4"/>
-            </w:tcBorders>
-            <w:tcMar>
-              <w:top w:w="50" w:type="dxa"/>
-              <w:left w:w="90" w:type="dxa"/>
-              <w:bottom w:w="50" w:type="dxa"/>
-              <w:right w:w="90" w:type="dxa"/>
-            </w:tcMar>
-          </w:tcPr>
-          <w:p>
-            <w:r>
-              <w:t>MSA-10 Three-role UI prototype (MED-18)</w:t>
-            </w:r>
-          </w:p>
-        </w:tc>
-        <w:tc>
-          <w:tcPr>
-            <w:tcW w:w="1435" w:type="dxa"/>
-            <w:tcBorders>
-              <w:top w:val="single" w:sz="4" w:space="0" w:color="A6B4C4"/>
-              <w:left w:val="single" w:sz="4" w:space="0" w:color="A6B4C4"/>
-              <w:bottom w:val="single" w:sz="4" w:space="0" w:color="A6B4C4"/>
-              <w:right w:val="single" w:sz="4" w:space="0" w:color="A6B4C4"/>
-            </w:tcBorders>
-            <w:tcMar>
-              <w:top w:w="50" w:type="dxa"/>
-              <w:left w:w="90" w:type="dxa"/>
-              <w:bottom w:w="50" w:type="dxa"/>
-              <w:right w:w="90" w:type="dxa"/>
-            </w:tcMar>
-          </w:tcPr>
-          <w:p>
-            <w:pPr>
-              <w:spacing w:after="20" w:line="252" w:lineRule="auto"/>
-              <w:rPr>
-                <w:lang w:val="ru-RU"/>
-              </w:rPr>
-            </w:pPr>
-            <w:r>
-              <w:rPr>
-                <w:sz w:val="17"/>
-                <w:szCs w:val="17"/>
-              </w:rPr>
+            <w:tcW w:type="dxa" w:w="4307"/>
+          </w:tcPr>
+          <w:p>
+            <w:r>
+              <w:t>MED-10 UI mockups for key scenarios</w:t>
+            </w:r>
+          </w:p>
+        </w:tc>
+        <w:tc>
+          <w:tcPr>
+            <w:tcW w:type="dxa" w:w="1435"/>
+          </w:tcPr>
+          <w:p>
+            <w:r>
               <w:t>Aknur</w:t>
             </w:r>
           </w:p>
         </w:tc>
         <w:tc>
           <w:tcPr>
-            <w:tcW w:w="923" w:type="dxa"/>
-            <w:tcBorders>
-              <w:top w:val="single" w:sz="4" w:space="0" w:color="A6B4C4"/>
-              <w:left w:val="single" w:sz="4" w:space="0" w:color="A6B4C4"/>
-              <w:bottom w:val="single" w:sz="4" w:space="0" w:color="A6B4C4"/>
-              <w:right w:val="single" w:sz="4" w:space="0" w:color="A6B4C4"/>
-            </w:tcBorders>
-            <w:tcMar>
-              <w:top w:w="50" w:type="dxa"/>
-              <w:left w:w="90" w:type="dxa"/>
-              <w:bottom w:w="50" w:type="dxa"/>
-              <w:right w:w="90" w:type="dxa"/>
-            </w:tcMar>
-          </w:tcPr>
-          <w:p>
-            <w:pPr>
-              <w:spacing w:after="20" w:line="252" w:lineRule="auto"/>
-            </w:pPr>
-            <w:r>
-              <w:rPr>
-                <w:sz w:val="17"/>
-                <w:szCs w:val="17"/>
-              </w:rPr>
-              <w:t>23 Oct</w:t>
-            </w:r>
-          </w:p>
-        </w:tc>
-        <w:tc>
-          <w:tcPr>
-            <w:tcW w:w="2361" w:type="dxa"/>
-            <w:tcBorders>
-              <w:top w:val="single" w:sz="4" w:space="0" w:color="A6B4C4"/>
-              <w:left w:val="single" w:sz="4" w:space="0" w:color="A6B4C4"/>
-              <w:bottom w:val="single" w:sz="4" w:space="0" w:color="A6B4C4"/>
-              <w:right w:val="single" w:sz="4" w:space="0" w:color="A6B4C4"/>
-            </w:tcBorders>
-            <w:tcMar>
-              <w:top w:w="50" w:type="dxa"/>
-              <w:left w:w="90" w:type="dxa"/>
-              <w:bottom w:w="50" w:type="dxa"/>
-              <w:right w:w="90" w:type="dxa"/>
-            </w:tcMar>
-          </w:tcPr>
-          <w:p>
-            <w:r>
-              <w:t>22-page PDF; doctor, patient and administrator flows; requirement mapping in Table 7</w:t>
+            <w:tcW w:type="dxa" w:w="923"/>
+          </w:tcPr>
+          <w:p>
+            <w:r>
+              <w:t>22 Oct 2026</w:t>
+            </w:r>
+          </w:p>
+        </w:tc>
+        <w:tc>
+          <w:tcPr>
+            <w:tcW w:type="dxa" w:w="2361"/>
+          </w:tcPr>
+          <w:p>
+            <w:r>
+              <w:t>UI mockups and supporting prototype materials</w:t>
             </w:r>
           </w:p>
         </w:tc>
@@ -2201,120 +1415,41 @@
         </w:trPr>
         <w:tc>
           <w:tcPr>
-            <w:tcW w:w="4307" w:type="dxa"/>
-            <w:tcBorders>
-              <w:top w:val="single" w:sz="4" w:space="0" w:color="A6B4C4"/>
-              <w:left w:val="single" w:sz="4" w:space="0" w:color="A6B4C4"/>
-              <w:bottom w:val="single" w:sz="4" w:space="0" w:color="A6B4C4"/>
-              <w:right w:val="single" w:sz="4" w:space="0" w:color="A6B4C4"/>
-            </w:tcBorders>
-            <w:tcMar>
-              <w:top w:w="50" w:type="dxa"/>
-              <w:left w:w="90" w:type="dxa"/>
-              <w:bottom w:w="50" w:type="dxa"/>
-              <w:right w:w="90" w:type="dxa"/>
-            </w:tcMar>
-          </w:tcPr>
-          <w:p>
-            <w:pPr>
-              <w:spacing w:after="20" w:line="252" w:lineRule="auto"/>
-            </w:pPr>
-            <w:r>
-              <w:rPr>
-                <w:sz w:val="17"/>
-                <w:szCs w:val="17"/>
-              </w:rPr>
-              <w:t>MSA-11 Verification and evaluation plan</w:t>
-            </w:r>
-          </w:p>
-        </w:tc>
-        <w:tc>
-          <w:tcPr>
-            <w:tcW w:w="1435" w:type="dxa"/>
-            <w:tcBorders>
-              <w:top w:val="single" w:sz="4" w:space="0" w:color="A6B4C4"/>
-              <w:left w:val="single" w:sz="4" w:space="0" w:color="A6B4C4"/>
-              <w:bottom w:val="single" w:sz="4" w:space="0" w:color="A6B4C4"/>
-              <w:right w:val="single" w:sz="4" w:space="0" w:color="A6B4C4"/>
-            </w:tcBorders>
-            <w:tcMar>
-              <w:top w:w="50" w:type="dxa"/>
-              <w:left w:w="90" w:type="dxa"/>
-              <w:bottom w:w="50" w:type="dxa"/>
-              <w:right w:w="90" w:type="dxa"/>
-            </w:tcMar>
-          </w:tcPr>
-          <w:p>
-            <w:pPr>
-              <w:spacing w:after="20" w:line="252" w:lineRule="auto"/>
-              <w:rPr>
-                <w:lang w:val="ru-RU"/>
-              </w:rPr>
-            </w:pPr>
-            <w:r>
-              <w:rPr>
-                <w:sz w:val="17"/>
-                <w:szCs w:val="17"/>
-              </w:rPr>
+            <w:tcW w:type="dxa" w:w="4307"/>
+          </w:tcPr>
+          <w:p>
+            <w:r>
+              <w:t>MED-11 Verification and evaluation plan</w:t>
+            </w:r>
+          </w:p>
+        </w:tc>
+        <w:tc>
+          <w:tcPr>
+            <w:tcW w:type="dxa" w:w="1435"/>
+          </w:tcPr>
+          <w:p>
+            <w:r>
               <w:t>Altynay</w:t>
             </w:r>
           </w:p>
         </w:tc>
         <w:tc>
           <w:tcPr>
-            <w:tcW w:w="923" w:type="dxa"/>
-            <w:tcBorders>
-              <w:top w:val="single" w:sz="4" w:space="0" w:color="A6B4C4"/>
-              <w:left w:val="single" w:sz="4" w:space="0" w:color="A6B4C4"/>
-              <w:bottom w:val="single" w:sz="4" w:space="0" w:color="A6B4C4"/>
-              <w:right w:val="single" w:sz="4" w:space="0" w:color="A6B4C4"/>
-            </w:tcBorders>
-            <w:tcMar>
-              <w:top w:w="50" w:type="dxa"/>
-              <w:left w:w="90" w:type="dxa"/>
-              <w:bottom w:w="50" w:type="dxa"/>
-              <w:right w:w="90" w:type="dxa"/>
-            </w:tcMar>
-          </w:tcPr>
-          <w:p>
-            <w:pPr>
-              <w:spacing w:after="20" w:line="252" w:lineRule="auto"/>
-            </w:pPr>
-            <w:r>
-              <w:rPr>
-                <w:sz w:val="17"/>
-                <w:szCs w:val="17"/>
-              </w:rPr>
-              <w:t>22 Oct</w:t>
-            </w:r>
-          </w:p>
-        </w:tc>
-        <w:tc>
-          <w:tcPr>
-            <w:tcW w:w="2361" w:type="dxa"/>
-            <w:tcBorders>
-              <w:top w:val="single" w:sz="4" w:space="0" w:color="A6B4C4"/>
-              <w:left w:val="single" w:sz="4" w:space="0" w:color="A6B4C4"/>
-              <w:bottom w:val="single" w:sz="4" w:space="0" w:color="A6B4C4"/>
-              <w:right w:val="single" w:sz="4" w:space="0" w:color="A6B4C4"/>
-            </w:tcBorders>
-            <w:tcMar>
-              <w:top w:w="50" w:type="dxa"/>
-              <w:left w:w="90" w:type="dxa"/>
-              <w:bottom w:w="50" w:type="dxa"/>
-              <w:right w:w="90" w:type="dxa"/>
-            </w:tcMar>
-          </w:tcPr>
-          <w:p>
-            <w:pPr>
-              <w:spacing w:after="20" w:line="252" w:lineRule="auto"/>
-            </w:pPr>
-            <w:r>
-              <w:rPr>
-                <w:sz w:val="17"/>
-                <w:szCs w:val="17"/>
-              </w:rPr>
-              <w:t>Section 9 approved; testing part reviewed by QA</w:t>
+            <w:tcW w:type="dxa" w:w="923"/>
+          </w:tcPr>
+          <w:p>
+            <w:r>
+              <w:t>21 Oct 2026</w:t>
+            </w:r>
+          </w:p>
+        </w:tc>
+        <w:tc>
+          <w:tcPr>
+            <w:tcW w:type="dxa" w:w="2361"/>
+          </w:tcPr>
+          <w:p>
+            <w:r>
+              <w:t>Evaluation plan and QA review</w:t>
             </w:r>
           </w:p>
         </w:tc>
@@ -2325,103 +1460,41 @@
         </w:trPr>
         <w:tc>
           <w:tcPr>
-            <w:tcW w:w="4307" w:type="dxa"/>
-            <w:tcBorders>
-              <w:top w:val="single" w:sz="4" w:space="0" w:color="A6B4C4"/>
-              <w:left w:val="single" w:sz="4" w:space="0" w:color="A6B4C4"/>
-              <w:bottom w:val="single" w:sz="4" w:space="0" w:color="A6B4C4"/>
-              <w:right w:val="single" w:sz="4" w:space="0" w:color="A6B4C4"/>
-            </w:tcBorders>
-            <w:tcMar>
-              <w:top w:w="50" w:type="dxa"/>
-              <w:left w:w="90" w:type="dxa"/>
-              <w:bottom w:w="50" w:type="dxa"/>
-              <w:right w:w="90" w:type="dxa"/>
-            </w:tcMar>
-          </w:tcPr>
-          <w:p>
-            <w:r>
-              <w:t>MSA-12 Pilot: generate synthetic patients with team scripts; normalise 10 drug names via RxNorm API</w:t>
-            </w:r>
-          </w:p>
-        </w:tc>
-        <w:tc>
-          <w:tcPr>
-            <w:tcW w:w="1435" w:type="dxa"/>
-            <w:tcBorders>
-              <w:top w:val="single" w:sz="4" w:space="0" w:color="A6B4C4"/>
-              <w:left w:val="single" w:sz="4" w:space="0" w:color="A6B4C4"/>
-              <w:bottom w:val="single" w:sz="4" w:space="0" w:color="A6B4C4"/>
-              <w:right w:val="single" w:sz="4" w:space="0" w:color="A6B4C4"/>
-            </w:tcBorders>
-            <w:tcMar>
-              <w:top w:w="50" w:type="dxa"/>
-              <w:left w:w="90" w:type="dxa"/>
-              <w:bottom w:w="50" w:type="dxa"/>
-              <w:right w:w="90" w:type="dxa"/>
-            </w:tcMar>
-          </w:tcPr>
-          <w:p>
-            <w:pPr>
-              <w:spacing w:after="20" w:line="252" w:lineRule="auto"/>
-            </w:pPr>
-            <w:r>
-              <w:rPr>
-                <w:sz w:val="17"/>
-                <w:szCs w:val="17"/>
-              </w:rPr>
+            <w:tcW w:type="dxa" w:w="4307"/>
+          </w:tcPr>
+          <w:p>
+            <w:r>
+              <w:t>MED-12 Data pilot: sample and RxNorm API</w:t>
+            </w:r>
+          </w:p>
+        </w:tc>
+        <w:tc>
+          <w:tcPr>
+            <w:tcW w:type="dxa" w:w="1435"/>
+          </w:tcPr>
+          <w:p>
+            <w:r>
               <w:t>Aknur</w:t>
             </w:r>
           </w:p>
         </w:tc>
         <w:tc>
           <w:tcPr>
-            <w:tcW w:w="923" w:type="dxa"/>
-            <w:tcBorders>
-              <w:top w:val="single" w:sz="4" w:space="0" w:color="A6B4C4"/>
-              <w:left w:val="single" w:sz="4" w:space="0" w:color="A6B4C4"/>
-              <w:bottom w:val="single" w:sz="4" w:space="0" w:color="A6B4C4"/>
-              <w:right w:val="single" w:sz="4" w:space="0" w:color="A6B4C4"/>
-            </w:tcBorders>
-            <w:tcMar>
-              <w:top w:w="50" w:type="dxa"/>
-              <w:left w:w="90" w:type="dxa"/>
-              <w:bottom w:w="50" w:type="dxa"/>
-              <w:right w:w="90" w:type="dxa"/>
-            </w:tcMar>
-          </w:tcPr>
-          <w:p>
-            <w:pPr>
-              <w:spacing w:after="20" w:line="252" w:lineRule="auto"/>
-            </w:pPr>
-            <w:r>
-              <w:rPr>
-                <w:sz w:val="17"/>
-                <w:szCs w:val="17"/>
-              </w:rPr>
-              <w:t>23 Oct</w:t>
-            </w:r>
-          </w:p>
-        </w:tc>
-        <w:tc>
-          <w:tcPr>
-            <w:tcW w:w="2361" w:type="dxa"/>
-            <w:tcBorders>
-              <w:top w:val="single" w:sz="4" w:space="0" w:color="A6B4C4"/>
-              <w:left w:val="single" w:sz="4" w:space="0" w:color="A6B4C4"/>
-              <w:bottom w:val="single" w:sz="4" w:space="0" w:color="A6B4C4"/>
-              <w:right w:val="single" w:sz="4" w:space="0" w:color="A6B4C4"/>
-            </w:tcBorders>
-            <w:tcMar>
-              <w:top w:w="50" w:type="dxa"/>
-              <w:left w:w="90" w:type="dxa"/>
-              <w:bottom w:w="50" w:type="dxa"/>
-              <w:right w:w="90" w:type="dxa"/>
-            </w:tcMar>
-          </w:tcPr>
-          <w:p>
-            <w:r>
-              <w:t>Reproducible synthetic-data generator with fixed seed; short normalisation report</w:t>
+            <w:tcW w:type="dxa" w:w="923"/>
+          </w:tcPr>
+          <w:p>
+            <w:r>
+              <w:t>23 Oct 2026</w:t>
+            </w:r>
+          </w:p>
+        </w:tc>
+        <w:tc>
+          <w:tcPr>
+            <w:tcW w:type="dxa" w:w="2361"/>
+          </w:tcPr>
+          <w:p>
+            <w:r>
+              <w:t>Pilot data and drug-name normalisation evidence</w:t>
             </w:r>
           </w:p>
         </w:tc>
@@ -2432,117 +1505,41 @@
         </w:trPr>
         <w:tc>
           <w:tcPr>
-            <w:tcW w:w="4307" w:type="dxa"/>
-            <w:tcBorders>
-              <w:top w:val="single" w:sz="4" w:space="0" w:color="A6B4C4"/>
-              <w:left w:val="single" w:sz="4" w:space="0" w:color="A6B4C4"/>
-              <w:bottom w:val="single" w:sz="4" w:space="0" w:color="A6B4C4"/>
-              <w:right w:val="single" w:sz="4" w:space="0" w:color="A6B4C4"/>
-            </w:tcBorders>
-            <w:tcMar>
-              <w:top w:w="50" w:type="dxa"/>
-              <w:left w:w="90" w:type="dxa"/>
-              <w:bottom w:w="50" w:type="dxa"/>
-              <w:right w:w="90" w:type="dxa"/>
-            </w:tcMar>
-          </w:tcPr>
-          <w:p>
-            <w:pPr>
-              <w:spacing w:after="20" w:line="252" w:lineRule="auto"/>
-            </w:pPr>
-            <w:r>
-              <w:rPr>
-                <w:sz w:val="17"/>
-                <w:szCs w:val="17"/>
-              </w:rPr>
-              <w:t>MSA-13 Rule-base pilot: DDInter records for in-scope drug groups</w:t>
-            </w:r>
-          </w:p>
-        </w:tc>
-        <w:tc>
-          <w:tcPr>
-            <w:tcW w:w="1435" w:type="dxa"/>
-            <w:tcBorders>
-              <w:top w:val="single" w:sz="4" w:space="0" w:color="A6B4C4"/>
-              <w:left w:val="single" w:sz="4" w:space="0" w:color="A6B4C4"/>
-              <w:bottom w:val="single" w:sz="4" w:space="0" w:color="A6B4C4"/>
-              <w:right w:val="single" w:sz="4" w:space="0" w:color="A6B4C4"/>
-            </w:tcBorders>
-            <w:tcMar>
-              <w:top w:w="50" w:type="dxa"/>
-              <w:left w:w="90" w:type="dxa"/>
-              <w:bottom w:w="50" w:type="dxa"/>
-              <w:right w:w="90" w:type="dxa"/>
-            </w:tcMar>
-          </w:tcPr>
-          <w:p>
-            <w:pPr>
-              <w:spacing w:after="20" w:line="252" w:lineRule="auto"/>
-            </w:pPr>
-            <w:r>
-              <w:rPr>
-                <w:sz w:val="17"/>
-                <w:szCs w:val="17"/>
-              </w:rPr>
+            <w:tcW w:type="dxa" w:w="4307"/>
+          </w:tcPr>
+          <w:p>
+            <w:r>
+              <w:t>MED-13 Rule-base pilot: DDInter data</w:t>
+            </w:r>
+          </w:p>
+        </w:tc>
+        <w:tc>
+          <w:tcPr>
+            <w:tcW w:type="dxa" w:w="1435"/>
+          </w:tcPr>
+          <w:p>
+            <w:r>
               <w:t>Altynay</w:t>
             </w:r>
           </w:p>
         </w:tc>
         <w:tc>
           <w:tcPr>
-            <w:tcW w:w="923" w:type="dxa"/>
-            <w:tcBorders>
-              <w:top w:val="single" w:sz="4" w:space="0" w:color="A6B4C4"/>
-              <w:left w:val="single" w:sz="4" w:space="0" w:color="A6B4C4"/>
-              <w:bottom w:val="single" w:sz="4" w:space="0" w:color="A6B4C4"/>
-              <w:right w:val="single" w:sz="4" w:space="0" w:color="A6B4C4"/>
-            </w:tcBorders>
-            <w:tcMar>
-              <w:top w:w="50" w:type="dxa"/>
-              <w:left w:w="90" w:type="dxa"/>
-              <w:bottom w:w="50" w:type="dxa"/>
-              <w:right w:w="90" w:type="dxa"/>
-            </w:tcMar>
-          </w:tcPr>
-          <w:p>
-            <w:pPr>
-              <w:spacing w:after="20" w:line="252" w:lineRule="auto"/>
-            </w:pPr>
-            <w:r>
-              <w:rPr>
-                <w:sz w:val="17"/>
-                <w:szCs w:val="17"/>
-              </w:rPr>
-              <w:t>23 Oct</w:t>
-            </w:r>
-          </w:p>
-        </w:tc>
-        <w:tc>
-          <w:tcPr>
-            <w:tcW w:w="2361" w:type="dxa"/>
-            <w:tcBorders>
-              <w:top w:val="single" w:sz="4" w:space="0" w:color="A6B4C4"/>
-              <w:left w:val="single" w:sz="4" w:space="0" w:color="A6B4C4"/>
-              <w:bottom w:val="single" w:sz="4" w:space="0" w:color="A6B4C4"/>
-              <w:right w:val="single" w:sz="4" w:space="0" w:color="A6B4C4"/>
-            </w:tcBorders>
-            <w:tcMar>
-              <w:top w:w="50" w:type="dxa"/>
-              <w:left w:w="90" w:type="dxa"/>
-              <w:bottom w:w="50" w:type="dxa"/>
-              <w:right w:w="90" w:type="dxa"/>
-            </w:tcMar>
-          </w:tcPr>
-          <w:p>
-            <w:pPr>
-              <w:spacing w:after="20" w:line="252" w:lineRule="auto"/>
-            </w:pPr>
-            <w:r>
-              <w:rPr>
-                <w:sz w:val="17"/>
-                <w:szCs w:val="17"/>
-              </w:rPr>
-              <w:t>20+ records with severity and source; Rule format agreed with backend</w:t>
+            <w:tcW w:type="dxa" w:w="923"/>
+          </w:tcPr>
+          <w:p>
+            <w:r>
+              <w:t>23 Oct 2026</w:t>
+            </w:r>
+          </w:p>
+        </w:tc>
+        <w:tc>
+          <w:tcPr>
+            <w:tcW w:type="dxa" w:w="2361"/>
+          </w:tcPr>
+          <w:p>
+            <w:r>
+              <w:t>Curated records and traceable sources</w:t>
             </w:r>
           </w:p>
         </w:tc>
@@ -2553,120 +1550,176 @@
         </w:trPr>
         <w:tc>
           <w:tcPr>
-            <w:tcW w:w="4307" w:type="dxa"/>
-            <w:tcBorders>
-              <w:top w:val="single" w:sz="4" w:space="0" w:color="A6B4C4"/>
-              <w:left w:val="single" w:sz="4" w:space="0" w:color="A6B4C4"/>
-              <w:bottom w:val="single" w:sz="4" w:space="0" w:color="A6B4C4"/>
-              <w:right w:val="single" w:sz="4" w:space="0" w:color="A6B4C4"/>
-            </w:tcBorders>
-            <w:tcMar>
-              <w:top w:w="50" w:type="dxa"/>
-              <w:left w:w="90" w:type="dxa"/>
-              <w:bottom w:w="50" w:type="dxa"/>
-              <w:right w:w="90" w:type="dxa"/>
-            </w:tcMar>
-          </w:tcPr>
-          <w:p>
-            <w:pPr>
-              <w:spacing w:after="20" w:line="252" w:lineRule="auto"/>
-            </w:pPr>
-            <w:r>
-              <w:rPr>
-                <w:sz w:val="17"/>
-                <w:szCs w:val="17"/>
-              </w:rPr>
-              <w:t>MSA-14 Supervisor review, feedback log, tag prob-period-1, submission form</w:t>
-            </w:r>
-          </w:p>
-        </w:tc>
-        <w:tc>
-          <w:tcPr>
-            <w:tcW w:w="1435" w:type="dxa"/>
-            <w:tcBorders>
-              <w:top w:val="single" w:sz="4" w:space="0" w:color="A6B4C4"/>
-              <w:left w:val="single" w:sz="4" w:space="0" w:color="A6B4C4"/>
-              <w:bottom w:val="single" w:sz="4" w:space="0" w:color="A6B4C4"/>
-              <w:right w:val="single" w:sz="4" w:space="0" w:color="A6B4C4"/>
-            </w:tcBorders>
-            <w:tcMar>
-              <w:top w:w="50" w:type="dxa"/>
-              <w:left w:w="90" w:type="dxa"/>
-              <w:bottom w:w="50" w:type="dxa"/>
-              <w:right w:w="90" w:type="dxa"/>
-            </w:tcMar>
-          </w:tcPr>
-          <w:p>
-            <w:pPr>
-              <w:spacing w:after="20" w:line="252" w:lineRule="auto"/>
-              <w:rPr>
-                <w:lang w:val="en-US"/>
-              </w:rPr>
-            </w:pPr>
-            <w:r>
-              <w:rPr>
-                <w:sz w:val="17"/>
-                <w:szCs w:val="17"/>
-              </w:rPr>
+            <w:tcW w:type="dxa" w:w="4307"/>
+          </w:tcPr>
+          <w:p>
+            <w:r>
+              <w:t>MED-14 Supervisor review and submission tag</w:t>
+            </w:r>
+          </w:p>
+        </w:tc>
+        <w:tc>
+          <w:tcPr>
+            <w:tcW w:type="dxa" w:w="1435"/>
+          </w:tcPr>
+          <w:p>
+            <w:r>
               <w:t>Nuray</w:t>
             </w:r>
           </w:p>
         </w:tc>
         <w:tc>
           <w:tcPr>
-            <w:tcW w:w="923" w:type="dxa"/>
-            <w:tcBorders>
-              <w:top w:val="single" w:sz="4" w:space="0" w:color="A6B4C4"/>
-              <w:left w:val="single" w:sz="4" w:space="0" w:color="A6B4C4"/>
-              <w:bottom w:val="single" w:sz="4" w:space="0" w:color="A6B4C4"/>
-              <w:right w:val="single" w:sz="4" w:space="0" w:color="A6B4C4"/>
-            </w:tcBorders>
-            <w:tcMar>
-              <w:top w:w="50" w:type="dxa"/>
-              <w:left w:w="90" w:type="dxa"/>
-              <w:bottom w:w="50" w:type="dxa"/>
-              <w:right w:w="90" w:type="dxa"/>
-            </w:tcMar>
-          </w:tcPr>
-          <w:p>
-            <w:pPr>
-              <w:spacing w:after="20" w:line="252" w:lineRule="auto"/>
-            </w:pPr>
-            <w:r>
-              <w:rPr>
-                <w:sz w:val="17"/>
-                <w:szCs w:val="17"/>
-              </w:rPr>
-              <w:t>24 Oct, 18:00</w:t>
-            </w:r>
-          </w:p>
-        </w:tc>
-        <w:tc>
-          <w:tcPr>
-            <w:tcW w:w="2361" w:type="dxa"/>
-            <w:tcBorders>
-              <w:top w:val="single" w:sz="4" w:space="0" w:color="A6B4C4"/>
-              <w:left w:val="single" w:sz="4" w:space="0" w:color="A6B4C4"/>
-              <w:bottom w:val="single" w:sz="4" w:space="0" w:color="A6B4C4"/>
-              <w:right w:val="single" w:sz="4" w:space="0" w:color="A6B4C4"/>
-            </w:tcBorders>
-            <w:tcMar>
-              <w:top w:w="50" w:type="dxa"/>
-              <w:left w:w="90" w:type="dxa"/>
-              <w:bottom w:w="50" w:type="dxa"/>
-              <w:right w:w="90" w:type="dxa"/>
-            </w:tcMar>
-          </w:tcPr>
-          <w:p>
-            <w:pPr>
-              <w:spacing w:after="20" w:line="252" w:lineRule="auto"/>
-            </w:pPr>
-            <w:r>
-              <w:rPr>
-                <w:sz w:val="17"/>
-                <w:szCs w:val="17"/>
-              </w:rPr>
-              <w:t>Tag created; feedback table (Section 11) filled; form submitted</w:t>
+            <w:tcW w:type="dxa" w:w="923"/>
+          </w:tcPr>
+          <w:p>
+            <w:r>
+              <w:t>24 Oct 2026, 18:00</w:t>
+            </w:r>
+          </w:p>
+        </w:tc>
+        <w:tc>
+          <w:tcPr>
+            <w:tcW w:type="dxa" w:w="2361"/>
+          </w:tcPr>
+          <w:p>
+            <w:r>
+              <w:t>Supervisor feedback and pre-defense-1 tag, subject to submission confirmation</w:t>
+            </w:r>
+          </w:p>
+        </w:tc>
+      </w:tr>
+      <w:tr>
+        <w:trPr>
+          <w:cantSplit/>
+        </w:trPr>
+        <w:tc>
+          <w:tcPr>
+            <w:tcW w:type="dxa" w:w="4307"/>
+          </w:tcPr>
+          <w:p>
+            <w:r>
+              <w:t>MED-16 Evidence of relevance with physician interview P1</w:t>
+            </w:r>
+          </w:p>
+        </w:tc>
+        <w:tc>
+          <w:tcPr>
+            <w:tcW w:type="dxa" w:w="1435"/>
+          </w:tcPr>
+          <w:p>
+            <w:r>
+              <w:t>Aknur</w:t>
+            </w:r>
+          </w:p>
+        </w:tc>
+        <w:tc>
+          <w:tcPr>
+            <w:tcW w:type="dxa" w:w="923"/>
+          </w:tcPr>
+          <w:p>
+            <w:r>
+              <w:t>24 Oct 2026</w:t>
+            </w:r>
+          </w:p>
+        </w:tc>
+        <w:tc>
+          <w:tcPr>
+            <w:tcW w:type="dxa" w:w="2361"/>
+          </w:tcPr>
+          <w:p>
+            <w:r>
+              <w:t>Anonymised interview evidence and consent kept outside repository</w:t>
+            </w:r>
+          </w:p>
+        </w:tc>
+      </w:tr>
+      <w:tr>
+        <w:trPr>
+          <w:cantSplit/>
+        </w:trPr>
+        <w:tc>
+          <w:tcPr>
+            <w:tcW w:type="dxa" w:w="4307"/>
+          </w:tcPr>
+          <w:p>
+            <w:r>
+              <w:t>MED-17 Use Case diagram (Section 7.2)</w:t>
+            </w:r>
+          </w:p>
+        </w:tc>
+        <w:tc>
+          <w:tcPr>
+            <w:tcW w:type="dxa" w:w="1435"/>
+          </w:tcPr>
+          <w:p>
+            <w:r>
+              <w:t>Aknur</w:t>
+            </w:r>
+          </w:p>
+        </w:tc>
+        <w:tc>
+          <w:tcPr>
+            <w:tcW w:type="dxa" w:w="923"/>
+          </w:tcPr>
+          <w:p>
+            <w:r>
+              <w:t>24 Oct 2026</w:t>
+            </w:r>
+          </w:p>
+        </w:tc>
+        <w:tc>
+          <w:tcPr>
+            <w:tcW w:type="dxa" w:w="2361"/>
+          </w:tcPr>
+          <w:p>
+            <w:r>
+              <w:t>Use case catalogue and editable diagram</w:t>
+            </w:r>
+          </w:p>
+        </w:tc>
+      </w:tr>
+      <w:tr>
+        <w:trPr>
+          <w:cantSplit/>
+        </w:trPr>
+        <w:tc>
+          <w:tcPr>
+            <w:tcW w:type="dxa" w:w="4307"/>
+          </w:tcPr>
+          <w:p>
+            <w:r>
+              <w:t>MED-18 UI prototype for three roles</w:t>
+            </w:r>
+          </w:p>
+        </w:tc>
+        <w:tc>
+          <w:tcPr>
+            <w:tcW w:type="dxa" w:w="1435"/>
+          </w:tcPr>
+          <w:p>
+            <w:r>
+              <w:t>Aknur</w:t>
+            </w:r>
+          </w:p>
+        </w:tc>
+        <w:tc>
+          <w:tcPr>
+            <w:tcW w:type="dxa" w:w="923"/>
+          </w:tcPr>
+          <w:p>
+            <w:r>
+              <w:t>24 Oct 2026</w:t>
+            </w:r>
+          </w:p>
+        </w:tc>
+        <w:tc>
+          <w:tcPr>
+            <w:tcW w:type="dxa" w:w="2361"/>
+          </w:tcPr>
+          <w:p>
+            <w:r>
+              <w:t>22-page prototype and traceability mapping</w:t>
             </w:r>
           </w:p>
         </w:tc>
@@ -2680,27 +1733,17 @@
     <w:p>
       <w:pPr>
         <w:pStyle w:val="2"/>
-        <w:rPr>
-          <w:rFonts w:ascii="Times New Roman" w:hAnsi="Times New Roman" w:cs="Times New Roman"/>
-        </w:rPr>
       </w:pPr>
       <w:r>
-        <w:rPr>
-          <w:rFonts w:ascii="Times New Roman" w:hAnsi="Times New Roman" w:cs="Times New Roman"/>
-        </w:rPr>
         <w:t>10.</w:t>
       </w:r>
       <w:r>
         <w:rPr>
-          <w:rFonts w:ascii="Times New Roman" w:hAnsi="Times New Roman" w:cs="Times New Roman"/>
           <w:lang w:val="ru-RU"/>
         </w:rPr>
         <w:t>4</w:t>
       </w:r>
       <w:r>
-        <w:rPr>
-          <w:rFonts w:ascii="Times New Roman" w:hAnsi="Times New Roman" w:cs="Times New Roman"/>
-        </w:rPr>
         <w:t xml:space="preserve"> Risks</w:t>
       </w:r>
     </w:p>
@@ -2746,6 +1789,8 @@
       <w:tr>
         <w:trPr>
           <w:tblHeader/>
+          <w:tblHeader w:val="true"/>
+          <w:cantSplit/>
         </w:trPr>
         <w:tc>
           <w:tcPr>
@@ -2911,6 +1956,7 @@
       <w:tr>
         <w:trPr>
           <w:cantSplit/>
+          <w:cantSplit/>
         </w:trPr>
         <w:tc>
           <w:tcPr>
@@ -3063,6 +2109,7 @@
       <w:tr>
         <w:trPr>
           <w:cantSplit/>
+          <w:cantSplit/>
         </w:trPr>
         <w:tc>
           <w:tcPr>
@@ -3208,6 +2255,7 @@
       <w:tr>
         <w:trPr>
           <w:cantSplit/>
+          <w:cantSplit/>
         </w:trPr>
         <w:tc>
           <w:tcPr>
@@ -3360,6 +2408,7 @@
       <w:tr>
         <w:trPr>
           <w:cantSplit/>
+          <w:cantSplit/>
         </w:trPr>
         <w:tc>
           <w:tcPr>
@@ -3505,6 +2554,7 @@
       <w:tr>
         <w:trPr>
           <w:cantSplit/>
+          <w:cantSplit/>
         </w:trPr>
         <w:tc>
           <w:tcPr>
@@ -3650,6 +2700,7 @@
       <w:tr>
         <w:trPr>
           <w:cantSplit/>
+          <w:cantSplit/>
         </w:trPr>
         <w:tc>
           <w:tcPr>
@@ -3676,7 +2727,6 @@
                 <w:sz w:val="17"/>
                 <w:szCs w:val="17"/>
               </w:rPr>
-              <w:lastRenderedPageBreak/>
               <w:t>R6</w:t>
             </w:r>
           </w:p>
@@ -3803,6 +2853,7 @@
       <w:tr>
         <w:trPr>
           <w:cantSplit/>
+          <w:cantSplit/>
         </w:trPr>
         <w:tc>
           <w:tcPr>
@@ -3955,6 +3006,7 @@
       <w:tr>
         <w:trPr>
           <w:cantSplit/>
+          <w:cantSplit/>
         </w:trPr>
         <w:tc>
           <w:tcPr>
@@ -4100,6 +3152,7 @@
       <w:tr>
         <w:trPr>
           <w:cantSplit/>
+          <w:cantSplit/>
         </w:trPr>
         <w:tc>
           <w:tcPr>
@@ -4148,7 +3201,7 @@
           </w:tcPr>
           <w:p>
             <w:r>
-              <w:t>Scope creep (additional drug groups, mobile/PWA interfaces, production EHR integration)</w:t>
+              <w:t>Scope creep (additional drug groups or production EHR integration)</w:t>
             </w:r>
           </w:p>
         </w:tc>
@@ -4230,7 +3283,7 @@
           </w:tcPr>
           <w:p>
             <w:r>
-              <w:t>Changes require supervisor approval; keep the diploma deliverable desktop web-only, use Telegram for reminders, and exclude production EHR integration.</w:t>
+              <w:t>Require supervisor approval for scope changes; keep the agreed desktop web scope and Telegram reminders.</w:t>
             </w:r>
           </w:p>
         </w:tc>
@@ -4247,27 +3300,17 @@
     <w:p>
       <w:pPr>
         <w:pStyle w:val="2"/>
-        <w:rPr>
-          <w:rFonts w:ascii="Times New Roman" w:hAnsi="Times New Roman" w:cs="Times New Roman"/>
-        </w:rPr>
       </w:pPr>
       <w:r>
-        <w:rPr>
-          <w:rFonts w:ascii="Times New Roman" w:hAnsi="Times New Roman" w:cs="Times New Roman"/>
-        </w:rPr>
         <w:t>10.</w:t>
       </w:r>
       <w:r>
         <w:rPr>
-          <w:rFonts w:ascii="Times New Roman" w:hAnsi="Times New Roman" w:cs="Times New Roman"/>
           <w:lang w:val="ru-RU"/>
         </w:rPr>
         <w:t>5</w:t>
       </w:r>
       <w:r>
-        <w:rPr>
-          <w:rFonts w:ascii="Times New Roman" w:hAnsi="Times New Roman" w:cs="Times New Roman"/>
-        </w:rPr>
         <w:t xml:space="preserve"> Dependencies</w:t>
       </w:r>
     </w:p>

</xml_diff>